<commit_message>
Major changes to streamlit, added different options for how many articles to pull
</commit_message>
<xml_diff>
--- a/scripts/test_report.docx
+++ b/scripts/test_report.docx
@@ -9,70 +9,28 @@
     </w:p>
     <w:p>
       <w:r>
-        <w:t>**Analysis Summary**</w:t>
+        <w:t xml:space="preserve">**Analysis Metadata** — Source: nih_reporter | Years: </w:t>
+      </w:r>
+      <w:r>
+        <w:t>[2025, 2026]</w:t>
+      </w:r>
+      <w:r>
+        <w:t xml:space="preserve"> | Unique docs: 605 | Passages: 2100 | Clusters: 154</w:t>
       </w:r>
     </w:p>
-    <w:p>
-      <w:pPr>
-        <w:pStyle w:val="ListBullet"/>
-      </w:pPr>
-      <w:r>
-        <w:t>Source: nih_reporter</w:t>
-      </w:r>
-    </w:p>
-    <w:p>
-      <w:pPr>
-        <w:pStyle w:val="ListBullet"/>
-      </w:pPr>
-      <w:r>
-        <w:t>Years: [2025]</w:t>
-      </w:r>
-    </w:p>
-    <w:p>
-      <w:pPr>
-        <w:pStyle w:val="ListBullet"/>
-      </w:pPr>
-      <w:r>
-        <w:t>Unique source documents retrieved: 100</w:t>
-      </w:r>
-    </w:p>
-    <w:p>
-      <w:pPr>
-        <w:pStyle w:val="ListBullet"/>
-      </w:pPr>
-      <w:r>
-        <w:t>Sentence passages analyzed: 1579</w:t>
-      </w:r>
-    </w:p>
-    <w:p>
-      <w:pPr>
-        <w:pStyle w:val="ListBullet"/>
-      </w:pPr>
-      <w:r>
-        <w:t>Research clusters identified: 110</w:t>
-      </w:r>
-    </w:p>
+    <w:p/>
     <w:p>
       <w:r>
         <w:t>────────────────────────────────────────────────────────────</w:t>
       </w:r>
     </w:p>
     <w:p/>
-    <w:p/>
     <w:p>
       <w:pPr>
         <w:pStyle w:val="Heading1"/>
       </w:pPr>
       <w:r>
-        <w:t>Parkinson Disease Research Trends: Mechanisms, Pathogenesis, and Neurodegeneration</w:t>
-      </w:r>
-    </w:p>
-    <w:p>
-      <w:pPr>
-        <w:pStyle w:val="Heading2"/>
-      </w:pPr>
-      <w:r>
-        <w:t>A Program Officer Report Based on NIH Reporter Data (2025)</w:t>
+        <w:t>BioInsight Report: Emerging Grant Themes in Parkinson's Disease for 2025</w:t>
       </w:r>
     </w:p>
     <w:p/>
@@ -87,68 +45,1925 @@
         <w:pStyle w:val="Heading2"/>
       </w:pPr>
       <w:r>
-        <w:t>1. Overview</w:t>
+        <w:t>Executive Summary</w:t>
       </w:r>
     </w:p>
     <w:p/>
     <w:p>
       <w:r>
-        <w:t xml:space="preserve">Parkinson disease (PD) affects over 1.5 million Americans and more than 10 million people globally </w:t>
+        <w:t>Direct answers to **"What are the emerging grant themes in Parkinson's disease for 2025?"**:</w:t>
+      </w:r>
+    </w:p>
+    <w:p/>
+    <w:p>
+      <w:pPr>
+        <w:pStyle w:val="ListBullet"/>
+      </w:pPr>
+      <w:r>
+        <w:t xml:space="preserve">**Prodromal PD and prevention trials are the top NIH/NINDS clinical priority.** NINDS has explicitly designated prodromal Parkinson's disease (PPD) characterization—including natural history, phenoconversion, and biomarker identification—as the highest-priority area to enable proof-of-concept prevention trials. </w:t>
       </w:r>
       <w:hyperlink r:id="rId9">
         <w:r>
           <w:rPr>
             <w:rStyle w:val="Hyperlink"/>
           </w:rPr>
-          <w:t>[Sidransky, 2025]</w:t>
+          <w:t>[Ascherio et al., 2025-2026]</w:t>
         </w:r>
       </w:hyperlink>
+    </w:p>
+    <w:p>
+      <w:pPr>
+        <w:pStyle w:val="ListBullet"/>
+      </w:pPr>
       <w:r>
-        <w:t xml:space="preserve">, with Parkinsonism diagnoses having doubled from 1990 to 2015 </w:t>
+        <w:t xml:space="preserve">**Novel small-molecule therapeutics are advancing across multiple genetic and molecular targets.** Active grant funding is supporting drug development against alpha-synuclein, GBA1 (glucocerebrosidase), and c-Abl, with the allosteric c-Abl inhibitor Neurotinib showing encouraging efficacy and CNS distribution in preclinical models. </w:t>
       </w:r>
       <w:hyperlink r:id="rId10">
         <w:r>
           <w:rPr>
             <w:rStyle w:val="Hyperlink"/>
           </w:rPr>
-          <w:t>[Barmpoutis, 2025]</w:t>
+          <w:t>[Marugan et al., 2025]</w:t>
         </w:r>
       </w:hyperlink>
+    </w:p>
+    <w:p>
+      <w:pPr>
+        <w:pStyle w:val="ListBullet"/>
+      </w:pPr>
       <w:r>
-        <w:t xml:space="preserve">. Synucleinopathies in aggregate—including PD, dementia with Lewy bodies (DLB), and multiple system atrophy (MSA)—afflict approximately 2 million Americans </w:t>
+        <w:t xml:space="preserve">**Blood-based and imaging biomarkers are a major growth area.** Extracellular vesicle immunoaffinity platforms for synucleinopathy detection </w:t>
       </w:r>
       <w:hyperlink r:id="rId11">
         <w:r>
           <w:rPr>
             <w:rStyle w:val="Hyperlink"/>
           </w:rPr>
-          <w:t>[Ju, 2025]</w:t>
+          <w:t>[Eitan et al., 2025]</w:t>
         </w:r>
       </w:hyperlink>
       <w:r>
-        <w:t xml:space="preserve">. Despite decades of research, no medications are yet proven to slow the progression of PD signs </w:t>
+        <w:t xml:space="preserve">, 7T MRI connectivity modeling </w:t>
       </w:r>
       <w:hyperlink r:id="rId12">
         <w:r>
           <w:rPr>
             <w:rStyle w:val="Hyperlink"/>
           </w:rPr>
-          <w:t>[Corcos et al., 2025]</w:t>
+          <w:t>[Harel et al., 2025]</w:t>
         </w:r>
       </w:hyperlink>
       <w:r>
-        <w:t xml:space="preserve">, and L-DOPA remains the gold standard of therapy after more than 50 years </w:t>
+        <w:t xml:space="preserve">, and biomarker-derived molecular correlates of cognitive decline </w:t>
       </w:r>
       <w:hyperlink r:id="rId13">
         <w:r>
           <w:rPr>
             <w:rStyle w:val="Hyperlink"/>
           </w:rPr>
-          <w:t>[Jaunarajs, 2025]</w:t>
+          <w:t>[Chen-Plotkin et al., 2025]</w:t>
         </w:r>
       </w:hyperlink>
       <w:r>
-        <w:t>. The current NIH-funded research portfolio reflects an expansive and mechanistically diverse effort to address this unmet need. Across 110 research clusters analyzed, dominant themes include alpha-synuclein biology and prion-like propagation, mitochondrial dysfunction, neuroinflammation and glial biology, genetic risk architecture, lysosomal pathway dysfunction, biomarker development, and translational therapeutic discovery. This report synthesizes verified findings across these domains, identifies key knowledge gaps, and flags emerging signals warranting programmatic attention.</w:t>
+        <w:t xml:space="preserve"> represent converging investment in non-invasive, scalable diagnostics.</w:t>
+      </w:r>
+    </w:p>
+    <w:p>
+      <w:pPr>
+        <w:pStyle w:val="ListBullet"/>
+      </w:pPr>
+      <w:r>
+        <w:t xml:space="preserve">**Cell/neuronal replacement and neurostimulation therapies are entering or completing early clinical stages.** A Phase 1 trial of bilateral intrastriatal grafting of ESC-derived human dopamine neurons has been completed </w:t>
+      </w:r>
+      <w:hyperlink r:id="rId14">
+        <w:r>
+          <w:rPr>
+            <w:rStyle w:val="Hyperlink"/>
+          </w:rPr>
+          <w:t>[Tabar et al., 2025]</w:t>
+        </w:r>
+      </w:hyperlink>
+      <w:r>
+        <w:t xml:space="preserve">, and early deep brain stimulation has shown Class II evidence of slowing tremor progression. </w:t>
+      </w:r>
+      <w:hyperlink r:id="rId15">
+        <w:r>
+          <w:rPr>
+            <w:rStyle w:val="Hyperlink"/>
+          </w:rPr>
+          <w:t>[Hacker et al., 2025]</w:t>
+        </w:r>
+      </w:hyperlink>
+    </w:p>
+    <w:p>
+      <w:pPr>
+        <w:pStyle w:val="ListBullet"/>
+      </w:pPr>
+      <w:r>
+        <w:t xml:space="preserve">**The gut-brain axis and neuroinflammation are emerging mechanistic themes.** Microbiome dysbiosis is now linked to alpha-synuclein pathology and clinical outcomes in prodromal Lewy body disease, with microbiome-targeting interventions positioned for clinical trials. </w:t>
+      </w:r>
+      <w:hyperlink r:id="rId16">
+        <w:r>
+          <w:rPr>
+            <w:rStyle w:val="Hyperlink"/>
+          </w:rPr>
+          <w:t>[Ryman et al., 2025]</w:t>
+        </w:r>
+      </w:hyperlink>
+    </w:p>
+    <w:p/>
+    <w:p>
+      <w:r>
+        <w:t>────────────────────────────────────────────────────────────</w:t>
+      </w:r>
+    </w:p>
+    <w:p/>
+    <w:p>
+      <w:pPr>
+        <w:pStyle w:val="Heading2"/>
+      </w:pPr>
+      <w:r>
+        <w:t>Key Entities at a Glance</w:t>
+      </w:r>
+    </w:p>
+    <w:p/>
+    <w:tbl>
+      <w:tblPr>
+        <w:tblStyle w:val="TableGrid"/>
+        <w:tblW w:type="auto" w:w="0"/>
+        <w:tblLook w:firstColumn="1" w:firstRow="1" w:lastColumn="0" w:lastRow="0" w:noHBand="0" w:noVBand="1" w:val="04A0"/>
+      </w:tblPr>
+      <w:tblGrid>
+        <w:gridCol w:w="1728"/>
+        <w:gridCol w:w="1728"/>
+        <w:gridCol w:w="1728"/>
+        <w:gridCol w:w="1728"/>
+        <w:gridCol w:w="1728"/>
+      </w:tblGrid>
+      <w:tr>
+        <w:tc>
+          <w:tcPr>
+            <w:tcW w:type="dxa" w:w="1728"/>
+          </w:tcPr>
+          <w:p>
+            <w:r>
+              <w:rPr>
+                <w:b/>
+              </w:rPr>
+            </w:r>
+            <w:r>
+              <w:rPr>
+                <w:b/>
+              </w:rPr>
+              <w:t>Entity</w:t>
+            </w:r>
+          </w:p>
+        </w:tc>
+        <w:tc>
+          <w:tcPr>
+            <w:tcW w:type="dxa" w:w="1728"/>
+          </w:tcPr>
+          <w:p>
+            <w:r>
+              <w:rPr>
+                <w:b/>
+              </w:rPr>
+            </w:r>
+            <w:r>
+              <w:rPr>
+                <w:b/>
+              </w:rPr>
+              <w:t>Type</w:t>
+            </w:r>
+          </w:p>
+        </w:tc>
+        <w:tc>
+          <w:tcPr>
+            <w:tcW w:type="dxa" w:w="1728"/>
+          </w:tcPr>
+          <w:p>
+            <w:r>
+              <w:rPr>
+                <w:b/>
+              </w:rPr>
+            </w:r>
+            <w:r>
+              <w:rPr>
+                <w:b/>
+              </w:rPr>
+              <w:t>Role in Parkinson</w:t>
+            </w:r>
+          </w:p>
+        </w:tc>
+        <w:tc>
+          <w:tcPr>
+            <w:tcW w:type="dxa" w:w="1728"/>
+          </w:tcPr>
+          <w:p>
+            <w:r>
+              <w:rPr>
+                <w:b/>
+              </w:rPr>
+            </w:r>
+            <w:r>
+              <w:rPr>
+                <w:b/>
+              </w:rPr>
+              <w:t>Key Finding</w:t>
+            </w:r>
+          </w:p>
+        </w:tc>
+        <w:tc>
+          <w:tcPr>
+            <w:tcW w:type="dxa" w:w="1728"/>
+          </w:tcPr>
+          <w:p>
+            <w:r>
+              <w:rPr>
+                <w:b/>
+              </w:rPr>
+            </w:r>
+            <w:r>
+              <w:rPr>
+                <w:b/>
+              </w:rPr>
+              <w:t>Citation</w:t>
+            </w:r>
+          </w:p>
+        </w:tc>
+      </w:tr>
+      <w:tr>
+        <w:tc>
+          <w:tcPr>
+            <w:tcW w:type="dxa" w:w="1728"/>
+          </w:tcPr>
+          <w:p>
+            <w:r/>
+            <w:r>
+              <w:t>α-Synuclein</w:t>
+            </w:r>
+          </w:p>
+        </w:tc>
+        <w:tc>
+          <w:tcPr>
+            <w:tcW w:type="dxa" w:w="1728"/>
+          </w:tcPr>
+          <w:p>
+            <w:r/>
+            <w:r>
+              <w:t>Protein/Biomarker</w:t>
+            </w:r>
+          </w:p>
+        </w:tc>
+        <w:tc>
+          <w:tcPr>
+            <w:tcW w:type="dxa" w:w="1728"/>
+          </w:tcPr>
+          <w:p>
+            <w:r/>
+            <w:r>
+              <w:t>Core pathogenic aggregating protein; diagnostic and therapeutic target</w:t>
+            </w:r>
+          </w:p>
+        </w:tc>
+        <w:tc>
+          <w:tcPr>
+            <w:tcW w:type="dxa" w:w="1728"/>
+          </w:tcPr>
+          <w:p>
+            <w:r/>
+            <w:r>
+              <w:t>Strain properties linked to PD-with-dementia progression; lead compound synthesis underway at Penn/WUSTL</w:t>
+            </w:r>
+          </w:p>
+        </w:tc>
+        <w:tc>
+          <w:tcPr>
+            <w:tcW w:type="dxa" w:w="1728"/>
+          </w:tcPr>
+          <w:p>
+            <w:r/>
+            <w:hyperlink r:id="rId17">
+              <w:r>
+                <w:rPr>
+                  <w:rStyle w:val="Hyperlink"/>
+                </w:rPr>
+                <w:t>[Mao et al., 2025]</w:t>
+              </w:r>
+            </w:hyperlink>
+            <w:r>
+              <w:t xml:space="preserve">; </w:t>
+            </w:r>
+            <w:hyperlink r:id="rId18">
+              <w:r>
+                <w:rPr>
+                  <w:rStyle w:val="Hyperlink"/>
+                </w:rPr>
+                <w:t>[Mach et al., 2025]</w:t>
+              </w:r>
+            </w:hyperlink>
+          </w:p>
+        </w:tc>
+      </w:tr>
+      <w:tr>
+        <w:tc>
+          <w:tcPr>
+            <w:tcW w:type="dxa" w:w="1728"/>
+          </w:tcPr>
+          <w:p>
+            <w:r/>
+            <w:r>
+              <w:t>GBA1 (glucocerebrosidase)</w:t>
+            </w:r>
+          </w:p>
+        </w:tc>
+        <w:tc>
+          <w:tcPr>
+            <w:tcW w:type="dxa" w:w="1728"/>
+          </w:tcPr>
+          <w:p>
+            <w:r/>
+            <w:r>
+              <w:t>Gene/Enzyme</w:t>
+            </w:r>
+          </w:p>
+        </w:tc>
+        <w:tc>
+          <w:tcPr>
+            <w:tcW w:type="dxa" w:w="1728"/>
+          </w:tcPr>
+          <w:p>
+            <w:r/>
+            <w:r>
+              <w:t>Major genetic risk factor; lysosomal pathway target</w:t>
+            </w:r>
+          </w:p>
+        </w:tc>
+        <w:tc>
+          <w:tcPr>
+            <w:tcW w:type="dxa" w:w="1728"/>
+          </w:tcPr>
+          <w:p>
+            <w:r/>
+            <w:r>
+              <w:t>Non-inhibitory pharmacological chaperones targeting the L444P variant in active development</w:t>
+            </w:r>
+          </w:p>
+        </w:tc>
+        <w:tc>
+          <w:tcPr>
+            <w:tcW w:type="dxa" w:w="1728"/>
+          </w:tcPr>
+          <w:p>
+            <w:r/>
+            <w:hyperlink r:id="rId10">
+              <w:r>
+                <w:rPr>
+                  <w:rStyle w:val="Hyperlink"/>
+                </w:rPr>
+                <w:t>[Marugan et al., 2025]</w:t>
+              </w:r>
+            </w:hyperlink>
+          </w:p>
+        </w:tc>
+      </w:tr>
+      <w:tr>
+        <w:tc>
+          <w:tcPr>
+            <w:tcW w:type="dxa" w:w="1728"/>
+          </w:tcPr>
+          <w:p>
+            <w:r/>
+            <w:r>
+              <w:t>c-Abl (ABL1)</w:t>
+            </w:r>
+          </w:p>
+        </w:tc>
+        <w:tc>
+          <w:tcPr>
+            <w:tcW w:type="dxa" w:w="1728"/>
+          </w:tcPr>
+          <w:p>
+            <w:r/>
+            <w:r>
+              <w:t>Kinase</w:t>
+            </w:r>
+          </w:p>
+        </w:tc>
+        <w:tc>
+          <w:tcPr>
+            <w:tcW w:type="dxa" w:w="1728"/>
+          </w:tcPr>
+          <w:p>
+            <w:r/>
+            <w:r>
+              <w:t>Mediates neurodegeneration signaling</w:t>
+            </w:r>
+          </w:p>
+        </w:tc>
+        <w:tc>
+          <w:tcPr>
+            <w:tcW w:type="dxa" w:w="1728"/>
+          </w:tcPr>
+          <w:p>
+            <w:r/>
+            <w:r>
+              <w:t>Allosteric inhibitor Neurotinib shows preclinical efficacy and preferential CNS distribution</w:t>
+            </w:r>
+          </w:p>
+        </w:tc>
+        <w:tc>
+          <w:tcPr>
+            <w:tcW w:type="dxa" w:w="1728"/>
+          </w:tcPr>
+          <w:p>
+            <w:r/>
+            <w:hyperlink r:id="rId10">
+              <w:r>
+                <w:rPr>
+                  <w:rStyle w:val="Hyperlink"/>
+                </w:rPr>
+                <w:t>[Marugan et al., 2025]</w:t>
+              </w:r>
+            </w:hyperlink>
+          </w:p>
+        </w:tc>
+      </w:tr>
+      <w:tr>
+        <w:tc>
+          <w:tcPr>
+            <w:tcW w:type="dxa" w:w="1728"/>
+          </w:tcPr>
+          <w:p>
+            <w:r/>
+            <w:r>
+              <w:t>LRRK2</w:t>
+            </w:r>
+          </w:p>
+        </w:tc>
+        <w:tc>
+          <w:tcPr>
+            <w:tcW w:type="dxa" w:w="1728"/>
+          </w:tcPr>
+          <w:p>
+            <w:r/>
+            <w:r>
+              <w:t>Kinase/Gene</w:t>
+            </w:r>
+          </w:p>
+        </w:tc>
+        <w:tc>
+          <w:tcPr>
+            <w:tcW w:type="dxa" w:w="1728"/>
+          </w:tcPr>
+          <w:p>
+            <w:r/>
+            <w:r>
+              <w:t>Familial PD risk gene; protein interaction target</w:t>
+            </w:r>
+          </w:p>
+        </w:tc>
+        <w:tc>
+          <w:tcPr>
+            <w:tcW w:type="dxa" w:w="1728"/>
+          </w:tcPr>
+          <w:p>
+            <w:r/>
+            <w:r>
+              <w:t>Interaction with 14-3-3 proteins identified as relevant to pathogenesis</w:t>
+            </w:r>
+          </w:p>
+        </w:tc>
+        <w:tc>
+          <w:tcPr>
+            <w:tcW w:type="dxa" w:w="1728"/>
+          </w:tcPr>
+          <w:p>
+            <w:r/>
+            <w:hyperlink r:id="rId19">
+              <w:r>
+                <w:rPr>
+                  <w:rStyle w:val="Hyperlink"/>
+                </w:rPr>
+                <w:t>[Cookson et al., 2025]</w:t>
+              </w:r>
+            </w:hyperlink>
+          </w:p>
+        </w:tc>
+      </w:tr>
+      <w:tr>
+        <w:tc>
+          <w:tcPr>
+            <w:tcW w:type="dxa" w:w="1728"/>
+          </w:tcPr>
+          <w:p>
+            <w:r/>
+            <w:r>
+              <w:t>PINK1/Parkin</w:t>
+            </w:r>
+          </w:p>
+        </w:tc>
+        <w:tc>
+          <w:tcPr>
+            <w:tcW w:type="dxa" w:w="1728"/>
+          </w:tcPr>
+          <w:p>
+            <w:r/>
+            <w:r>
+              <w:t>Proteins/Pathway</w:t>
+            </w:r>
+          </w:p>
+        </w:tc>
+        <w:tc>
+          <w:tcPr>
+            <w:tcW w:type="dxa" w:w="1728"/>
+          </w:tcPr>
+          <w:p>
+            <w:r/>
+            <w:r>
+              <w:t>Mitophagy regulation; mitochondrial quality control</w:t>
+            </w:r>
+          </w:p>
+        </w:tc>
+        <w:tc>
+          <w:tcPr>
+            <w:tcW w:type="dxa" w:w="1728"/>
+          </w:tcPr>
+          <w:p>
+            <w:r/>
+            <w:r>
+              <w:t>TBK1 functions in PINK1/Parkin-mediated mitophagy and STING innate immunity activation</w:t>
+            </w:r>
+          </w:p>
+        </w:tc>
+        <w:tc>
+          <w:tcPr>
+            <w:tcW w:type="dxa" w:w="1728"/>
+          </w:tcPr>
+          <w:p>
+            <w:r/>
+            <w:hyperlink r:id="rId20">
+              <w:r>
+                <w:rPr>
+                  <w:rStyle w:val="Hyperlink"/>
+                </w:rPr>
+                <w:t>[Youle, 2025]</w:t>
+              </w:r>
+            </w:hyperlink>
+          </w:p>
+        </w:tc>
+      </w:tr>
+      <w:tr>
+        <w:tc>
+          <w:tcPr>
+            <w:tcW w:type="dxa" w:w="1728"/>
+          </w:tcPr>
+          <w:p>
+            <w:r/>
+            <w:r>
+              <w:t>TBK1</w:t>
+            </w:r>
+          </w:p>
+        </w:tc>
+        <w:tc>
+          <w:tcPr>
+            <w:tcW w:type="dxa" w:w="1728"/>
+          </w:tcPr>
+          <w:p>
+            <w:r/>
+            <w:r>
+              <w:t>Kinase</w:t>
+            </w:r>
+          </w:p>
+        </w:tc>
+        <w:tc>
+          <w:tcPr>
+            <w:tcW w:type="dxa" w:w="1728"/>
+          </w:tcPr>
+          <w:p>
+            <w:r/>
+            <w:r>
+              <w:t>Links mitophagy and neuroinflammation</w:t>
+            </w:r>
+          </w:p>
+        </w:tc>
+        <w:tc>
+          <w:tcPr>
+            <w:tcW w:type="dxa" w:w="1728"/>
+          </w:tcPr>
+          <w:p>
+            <w:r/>
+            <w:r>
+              <w:t>Operates at intersection of PINK1/Parkin pathway and STING-mediated innate immunity</w:t>
+            </w:r>
+          </w:p>
+        </w:tc>
+        <w:tc>
+          <w:tcPr>
+            <w:tcW w:type="dxa" w:w="1728"/>
+          </w:tcPr>
+          <w:p>
+            <w:r/>
+            <w:hyperlink r:id="rId20">
+              <w:r>
+                <w:rPr>
+                  <w:rStyle w:val="Hyperlink"/>
+                </w:rPr>
+                <w:t>[Youle, 2025]</w:t>
+              </w:r>
+            </w:hyperlink>
+          </w:p>
+        </w:tc>
+      </w:tr>
+      <w:tr>
+        <w:tc>
+          <w:tcPr>
+            <w:tcW w:type="dxa" w:w="1728"/>
+          </w:tcPr>
+          <w:p>
+            <w:r/>
+            <w:r>
+              <w:t>CaV1.3 (voltage-gated calcium channel)</w:t>
+            </w:r>
+          </w:p>
+        </w:tc>
+        <w:tc>
+          <w:tcPr>
+            <w:tcW w:type="dxa" w:w="1728"/>
+          </w:tcPr>
+          <w:p>
+            <w:r/>
+            <w:r>
+              <w:t>Ion Channel</w:t>
+            </w:r>
+          </w:p>
+        </w:tc>
+        <w:tc>
+          <w:tcPr>
+            <w:tcW w:type="dxa" w:w="1728"/>
+          </w:tcPr>
+          <w:p>
+            <w:r/>
+            <w:r>
+              <w:t>Therapeutic target for levodopa-induced dyskinesia</w:t>
+            </w:r>
+          </w:p>
+        </w:tc>
+        <w:tc>
+          <w:tcPr>
+            <w:tcW w:type="dxa" w:w="1728"/>
+          </w:tcPr>
+          <w:p>
+            <w:r/>
+            <w:r>
+              <w:t>Validated as a target for LID amelioration in striatum</w:t>
+            </w:r>
+          </w:p>
+        </w:tc>
+        <w:tc>
+          <w:tcPr>
+            <w:tcW w:type="dxa" w:w="1728"/>
+          </w:tcPr>
+          <w:p>
+            <w:r/>
+            <w:hyperlink r:id="rId21">
+              <w:r>
+                <w:rPr>
+                  <w:rStyle w:val="Hyperlink"/>
+                </w:rPr>
+                <w:t>[Kordower et al., 2025]</w:t>
+              </w:r>
+            </w:hyperlink>
+          </w:p>
+        </w:tc>
+      </w:tr>
+      <w:tr>
+        <w:tc>
+          <w:tcPr>
+            <w:tcW w:type="dxa" w:w="1728"/>
+          </w:tcPr>
+          <w:p>
+            <w:r/>
+            <w:r>
+              <w:t>CHCHD2</w:t>
+            </w:r>
+          </w:p>
+        </w:tc>
+        <w:tc>
+          <w:tcPr>
+            <w:tcW w:type="dxa" w:w="1728"/>
+          </w:tcPr>
+          <w:p>
+            <w:r/>
+            <w:r>
+              <w:t>Protein</w:t>
+            </w:r>
+          </w:p>
+        </w:tc>
+        <w:tc>
+          <w:tcPr>
+            <w:tcW w:type="dxa" w:w="1728"/>
+          </w:tcPr>
+          <w:p>
+            <w:r/>
+            <w:r>
+              <w:t>Mitochondrial proteostasis regulator</w:t>
+            </w:r>
+          </w:p>
+        </w:tc>
+        <w:tc>
+          <w:tcPr>
+            <w:tcW w:type="dxa" w:w="1728"/>
+          </w:tcPr>
+          <w:p>
+            <w:r/>
+            <w:r>
+              <w:t>Levels decline in sporadic Lewy body disease; critical role in brain proteostasis</w:t>
+            </w:r>
+          </w:p>
+        </w:tc>
+        <w:tc>
+          <w:tcPr>
+            <w:tcW w:type="dxa" w:w="1728"/>
+          </w:tcPr>
+          <w:p>
+            <w:r/>
+            <w:hyperlink r:id="rId22">
+              <w:r>
+                <w:rPr>
+                  <w:rStyle w:val="Hyperlink"/>
+                </w:rPr>
+                <w:t>[Kang et al., 2025]</w:t>
+              </w:r>
+            </w:hyperlink>
+          </w:p>
+        </w:tc>
+      </w:tr>
+      <w:tr>
+        <w:tc>
+          <w:tcPr>
+            <w:tcW w:type="dxa" w:w="1728"/>
+          </w:tcPr>
+          <w:p>
+            <w:r/>
+            <w:r>
+              <w:t>APT1 (acyl protein thioesterase-1)</w:t>
+            </w:r>
+          </w:p>
+        </w:tc>
+        <w:tc>
+          <w:tcPr>
+            <w:tcW w:type="dxa" w:w="1728"/>
+          </w:tcPr>
+          <w:p>
+            <w:r/>
+            <w:r>
+              <w:t>Enzyme</w:t>
+            </w:r>
+          </w:p>
+        </w:tc>
+        <w:tc>
+          <w:tcPr>
+            <w:tcW w:type="dxa" w:w="1728"/>
+          </w:tcPr>
+          <w:p>
+            <w:r/>
+            <w:r>
+              <w:t>Palmitoylation regulator</w:t>
+            </w:r>
+          </w:p>
+        </w:tc>
+        <w:tc>
+          <w:tcPr>
+            <w:tcW w:type="dxa" w:w="1728"/>
+          </w:tcPr>
+          <w:p>
+            <w:r/>
+            <w:r>
+              <w:t>Inhibition of APT1 enhances palmitoylation and ameliorates α-synuclein cytopathology</w:t>
+            </w:r>
+          </w:p>
+        </w:tc>
+        <w:tc>
+          <w:tcPr>
+            <w:tcW w:type="dxa" w:w="1728"/>
+          </w:tcPr>
+          <w:p>
+            <w:r/>
+            <w:hyperlink r:id="rId23">
+              <w:r>
+                <w:rPr>
+                  <w:rStyle w:val="Hyperlink"/>
+                </w:rPr>
+                <w:t>[Ho et al., 2025]</w:t>
+              </w:r>
+            </w:hyperlink>
+          </w:p>
+        </w:tc>
+      </w:tr>
+      <w:tr>
+        <w:tc>
+          <w:tcPr>
+            <w:tcW w:type="dxa" w:w="1728"/>
+          </w:tcPr>
+          <w:p>
+            <w:r/>
+            <w:r>
+              <w:t>Tau</w:t>
+            </w:r>
+          </w:p>
+        </w:tc>
+        <w:tc>
+          <w:tcPr>
+            <w:tcW w:type="dxa" w:w="1728"/>
+          </w:tcPr>
+          <w:p>
+            <w:r/>
+            <w:r>
+              <w:t>Protein</w:t>
+            </w:r>
+          </w:p>
+        </w:tc>
+        <w:tc>
+          <w:tcPr>
+            <w:tcW w:type="dxa" w:w="1728"/>
+          </w:tcPr>
+          <w:p>
+            <w:r/>
+            <w:r>
+              <w:t>Co-pathology in PD; complicates cognitive decline</w:t>
+            </w:r>
+          </w:p>
+        </w:tc>
+        <w:tc>
+          <w:tcPr>
+            <w:tcW w:type="dxa" w:w="1728"/>
+          </w:tcPr>
+          <w:p>
+            <w:r/>
+            <w:r>
+              <w:t>Lead compound synthesis underway at Pitt in collaboration with Penn</w:t>
+            </w:r>
+          </w:p>
+        </w:tc>
+        <w:tc>
+          <w:tcPr>
+            <w:tcW w:type="dxa" w:w="1728"/>
+          </w:tcPr>
+          <w:p>
+            <w:r/>
+            <w:hyperlink r:id="rId18">
+              <w:r>
+                <w:rPr>
+                  <w:rStyle w:val="Hyperlink"/>
+                </w:rPr>
+                <w:t>[Mach et al., 2025]</w:t>
+              </w:r>
+            </w:hyperlink>
+          </w:p>
+        </w:tc>
+      </w:tr>
+      <w:tr>
+        <w:tc>
+          <w:tcPr>
+            <w:tcW w:type="dxa" w:w="1728"/>
+          </w:tcPr>
+          <w:p>
+            <w:r/>
+            <w:r>
+              <w:t>Histone deacetylases (HDACs)</w:t>
+            </w:r>
+          </w:p>
+        </w:tc>
+        <w:tc>
+          <w:tcPr>
+            <w:tcW w:type="dxa" w:w="1728"/>
+          </w:tcPr>
+          <w:p>
+            <w:r/>
+            <w:r>
+              <w:t>Enzyme class</w:t>
+            </w:r>
+          </w:p>
+        </w:tc>
+        <w:tc>
+          <w:tcPr>
+            <w:tcW w:type="dxa" w:w="1728"/>
+          </w:tcPr>
+          <w:p>
+            <w:r/>
+            <w:r>
+              <w:t>Epigenetic regulators in neurodegeneration</w:t>
+            </w:r>
+          </w:p>
+        </w:tc>
+        <w:tc>
+          <w:tcPr>
+            <w:tcW w:type="dxa" w:w="1728"/>
+          </w:tcPr>
+          <w:p>
+            <w:r/>
+            <w:r>
+              <w:t>HDAC inhibitors emerging as a therapeutic class for PD</w:t>
+            </w:r>
+          </w:p>
+        </w:tc>
+        <w:tc>
+          <w:tcPr>
+            <w:tcW w:type="dxa" w:w="1728"/>
+          </w:tcPr>
+          <w:p>
+            <w:r/>
+            <w:hyperlink r:id="rId24">
+              <w:r>
+                <w:rPr>
+                  <w:rStyle w:val="Hyperlink"/>
+                </w:rPr>
+                <w:t>[Chen et al., 2025]</w:t>
+              </w:r>
+            </w:hyperlink>
+          </w:p>
+        </w:tc>
+      </w:tr>
+      <w:tr>
+        <w:tc>
+          <w:tcPr>
+            <w:tcW w:type="dxa" w:w="1728"/>
+          </w:tcPr>
+          <w:p>
+            <w:r/>
+            <w:r>
+              <w:t>Gut microbiome</w:t>
+            </w:r>
+          </w:p>
+        </w:tc>
+        <w:tc>
+          <w:tcPr>
+            <w:tcW w:type="dxa" w:w="1728"/>
+          </w:tcPr>
+          <w:p>
+            <w:r/>
+            <w:r>
+              <w:t>Microbial community/Biomarker</w:t>
+            </w:r>
+          </w:p>
+        </w:tc>
+        <w:tc>
+          <w:tcPr>
+            <w:tcW w:type="dxa" w:w="1728"/>
+          </w:tcPr>
+          <w:p>
+            <w:r/>
+            <w:r>
+              <w:t>Prodromal disease marker; gut-brain axis mediator</w:t>
+            </w:r>
+          </w:p>
+        </w:tc>
+        <w:tc>
+          <w:tcPr>
+            <w:tcW w:type="dxa" w:w="1728"/>
+          </w:tcPr>
+          <w:p>
+            <w:r/>
+            <w:r>
+              <w:t>Dysbiosis and intestinal permeability linked to α-synuclein increases and midbrain degeneration</w:t>
+            </w:r>
+          </w:p>
+        </w:tc>
+        <w:tc>
+          <w:tcPr>
+            <w:tcW w:type="dxa" w:w="1728"/>
+          </w:tcPr>
+          <w:p>
+            <w:r/>
+            <w:hyperlink r:id="rId16">
+              <w:r>
+                <w:rPr>
+                  <w:rStyle w:val="Hyperlink"/>
+                </w:rPr>
+                <w:t>[Ryman et al., 2025]</w:t>
+              </w:r>
+            </w:hyperlink>
+          </w:p>
+        </w:tc>
+      </w:tr>
+      <w:tr>
+        <w:tc>
+          <w:tcPr>
+            <w:tcW w:type="dxa" w:w="1728"/>
+          </w:tcPr>
+          <w:p>
+            <w:r/>
+            <w:r>
+              <w:t>Extracellular vesicles (EVs)</w:t>
+            </w:r>
+          </w:p>
+        </w:tc>
+        <w:tc>
+          <w:tcPr>
+            <w:tcW w:type="dxa" w:w="1728"/>
+          </w:tcPr>
+          <w:p>
+            <w:r/>
+            <w:r>
+              <w:t>Biomarker platform</w:t>
+            </w:r>
+          </w:p>
+        </w:tc>
+        <w:tc>
+          <w:tcPr>
+            <w:tcW w:type="dxa" w:w="1728"/>
+          </w:tcPr>
+          <w:p>
+            <w:r/>
+            <w:r>
+              <w:t>Blood-based synucleinopathy detection</w:t>
+            </w:r>
+          </w:p>
+        </w:tc>
+        <w:tc>
+          <w:tcPr>
+            <w:tcW w:type="dxa" w:w="1728"/>
+          </w:tcPr>
+          <w:p>
+            <w:r/>
+            <w:r>
+              <w:t>Immunoaffinity isolation technology under development for high-sensitivity clinical detection</w:t>
+            </w:r>
+          </w:p>
+        </w:tc>
+        <w:tc>
+          <w:tcPr>
+            <w:tcW w:type="dxa" w:w="1728"/>
+          </w:tcPr>
+          <w:p>
+            <w:r/>
+            <w:hyperlink r:id="rId11">
+              <w:r>
+                <w:rPr>
+                  <w:rStyle w:val="Hyperlink"/>
+                </w:rPr>
+                <w:t>[Eitan et al., 2025]</w:t>
+              </w:r>
+            </w:hyperlink>
+          </w:p>
+        </w:tc>
+      </w:tr>
+      <w:tr>
+        <w:tc>
+          <w:tcPr>
+            <w:tcW w:type="dxa" w:w="1728"/>
+          </w:tcPr>
+          <w:p>
+            <w:r/>
+            <w:r>
+              <w:t>Neurotinib</w:t>
+            </w:r>
+          </w:p>
+        </w:tc>
+        <w:tc>
+          <w:tcPr>
+            <w:tcW w:type="dxa" w:w="1728"/>
+          </w:tcPr>
+          <w:p>
+            <w:r/>
+            <w:r>
+              <w:t>Small molecule drug</w:t>
+            </w:r>
+          </w:p>
+        </w:tc>
+        <w:tc>
+          <w:tcPr>
+            <w:tcW w:type="dxa" w:w="1728"/>
+          </w:tcPr>
+          <w:p>
+            <w:r/>
+            <w:r>
+              <w:t>c-Abl allosteric inhibitor; neuroprotective candidate</w:t>
+            </w:r>
+          </w:p>
+        </w:tc>
+        <w:tc>
+          <w:tcPr>
+            <w:tcW w:type="dxa" w:w="1728"/>
+          </w:tcPr>
+          <w:p>
+            <w:r/>
+            <w:r>
+              <w:t>Encouraging preclinical efficacy; favorable pharmacokinetics and CNS distribution</w:t>
+            </w:r>
+          </w:p>
+        </w:tc>
+        <w:tc>
+          <w:tcPr>
+            <w:tcW w:type="dxa" w:w="1728"/>
+          </w:tcPr>
+          <w:p>
+            <w:r/>
+            <w:hyperlink r:id="rId10">
+              <w:r>
+                <w:rPr>
+                  <w:rStyle w:val="Hyperlink"/>
+                </w:rPr>
+                <w:t>[Marugan et al., 2025]</w:t>
+              </w:r>
+            </w:hyperlink>
+          </w:p>
+        </w:tc>
+      </w:tr>
+      <w:tr>
+        <w:tc>
+          <w:tcPr>
+            <w:tcW w:type="dxa" w:w="1728"/>
+          </w:tcPr>
+          <w:p>
+            <w:r/>
+            <w:r>
+              <w:t>Dopamine neurons (ESC-derived)</w:t>
+            </w:r>
+          </w:p>
+        </w:tc>
+        <w:tc>
+          <w:tcPr>
+            <w:tcW w:type="dxa" w:w="1728"/>
+          </w:tcPr>
+          <w:p>
+            <w:r/>
+            <w:r>
+              <w:t>Cell therapy</w:t>
+            </w:r>
+          </w:p>
+        </w:tc>
+        <w:tc>
+          <w:tcPr>
+            <w:tcW w:type="dxa" w:w="1728"/>
+          </w:tcPr>
+          <w:p>
+            <w:r/>
+            <w:r>
+              <w:t>Neuronal replacement for dopaminergic deficit</w:t>
+            </w:r>
+          </w:p>
+        </w:tc>
+        <w:tc>
+          <w:tcPr>
+            <w:tcW w:type="dxa" w:w="1728"/>
+          </w:tcPr>
+          <w:p>
+            <w:r/>
+            <w:r>
+              <w:t>Phase 1 bilateral intrastriatal grafting trial completed</w:t>
+            </w:r>
+          </w:p>
+        </w:tc>
+        <w:tc>
+          <w:tcPr>
+            <w:tcW w:type="dxa" w:w="1728"/>
+          </w:tcPr>
+          <w:p>
+            <w:r/>
+            <w:hyperlink r:id="rId14">
+              <w:r>
+                <w:rPr>
+                  <w:rStyle w:val="Hyperlink"/>
+                </w:rPr>
+                <w:t>[Tabar et al., 2025]</w:t>
+              </w:r>
+            </w:hyperlink>
+          </w:p>
+        </w:tc>
+      </w:tr>
+      <w:tr>
+        <w:tc>
+          <w:tcPr>
+            <w:tcW w:type="dxa" w:w="1728"/>
+          </w:tcPr>
+          <w:p>
+            <w:r/>
+            <w:r>
+              <w:t>14-3-3 proteins</w:t>
+            </w:r>
+          </w:p>
+        </w:tc>
+        <w:tc>
+          <w:tcPr>
+            <w:tcW w:type="dxa" w:w="1728"/>
+          </w:tcPr>
+          <w:p>
+            <w:r/>
+            <w:r>
+              <w:t>Protein family</w:t>
+            </w:r>
+          </w:p>
+        </w:tc>
+        <w:tc>
+          <w:tcPr>
+            <w:tcW w:type="dxa" w:w="1728"/>
+          </w:tcPr>
+          <w:p>
+            <w:r/>
+            <w:r>
+              <w:t>LRRK2 interaction partners</w:t>
+            </w:r>
+          </w:p>
+        </w:tc>
+        <w:tc>
+          <w:tcPr>
+            <w:tcW w:type="dxa" w:w="1728"/>
+          </w:tcPr>
+          <w:p>
+            <w:r/>
+            <w:r>
+              <w:t>Molecular interaction with LRRK2 identified as relevant to PD pathogenesis</w:t>
+            </w:r>
+          </w:p>
+        </w:tc>
+        <w:tc>
+          <w:tcPr>
+            <w:tcW w:type="dxa" w:w="1728"/>
+          </w:tcPr>
+          <w:p>
+            <w:r/>
+            <w:hyperlink r:id="rId19">
+              <w:r>
+                <w:rPr>
+                  <w:rStyle w:val="Hyperlink"/>
+                </w:rPr>
+                <w:t>[Cookson et al., 2025]</w:t>
+              </w:r>
+            </w:hyperlink>
+          </w:p>
+        </w:tc>
+      </w:tr>
+    </w:tbl>
+    <w:p/>
+    <w:p>
+      <w:r>
+        <w:t>────────────────────────────────────────────────────────────</w:t>
+      </w:r>
+    </w:p>
+    <w:p/>
+    <w:p>
+      <w:pPr>
+        <w:pStyle w:val="Heading2"/>
+      </w:pPr>
+      <w:r>
+        <w:t>Research Findings by Theme</w:t>
+      </w:r>
+    </w:p>
+    <w:p/>
+    <w:p>
+      <w:r>
+        <w:t>The verified NIH grant funding landscape for Parkinson's disease in 2025 reveals a field organized around five converging priorities: catching disease before symptoms appear, developing mechanism-targeted therapies, building scalable biomarker platforms, advancing interventional neurology into clinical trials, and addressing understudied populations and systems. Together, these themes reflect a shift from purely symptomatic management toward disease modification and prevention.</w:t>
+      </w:r>
+    </w:p>
+    <w:p/>
+    <w:p>
+      <w:r>
+        <w:t>────────────────────────────────────────────────────────────</w:t>
+      </w:r>
+    </w:p>
+    <w:p/>
+    <w:p>
+      <w:pPr>
+        <w:pStyle w:val="Heading3"/>
+      </w:pPr>
+      <w:r>
+        <w:t>Theme 1: Prodromal PD — Prevention Before Symptoms Strike</w:t>
+      </w:r>
+    </w:p>
+    <w:p/>
+    <w:p>
+      <w:r>
+        <w:t>NINDS has made the characterization of prodromal Parkinson's disease its top clinical research priority for 2025, signaling a strategic pivot toward prevention. This theme encompasses natural history studies, biomarker discovery in pre-symptomatic populations, and the construction of trial-ready cohorts.</w:t>
+      </w:r>
+    </w:p>
+    <w:p/>
+    <w:p>
+      <w:pPr>
+        <w:pStyle w:val="ListBullet"/>
+      </w:pPr>
+      <w:r>
+        <w:t xml:space="preserve">NINDS has explicitly identified prodromal PD characterization—including phenoconversion events and biomarkers of prodromal subtypes—as the **highest priority for clinical PD research**, specifically to enable proof-of-concept prevention trials. </w:t>
+      </w:r>
+      <w:hyperlink r:id="rId9">
+        <w:r>
+          <w:rPr>
+            <w:rStyle w:val="Hyperlink"/>
+          </w:rPr>
+          <w:t>[Ascherio et al., 2025-2026]</w:t>
+        </w:r>
+      </w:hyperlink>
+    </w:p>
+    <w:p>
+      <w:pPr>
+        <w:pStyle w:val="ListBullet"/>
+      </w:pPr>
+      <w:r>
+        <w:t xml:space="preserve">REM sleep behavior disorder (RBD) is a key prodromal entry point: the NAPS2 clinical core is developing quantitative REM sleep without atonia measures from PSG data, integrating MRI and DaTscan imaging with biofluid samples to support disease-modifying therapy development targeting DLB, PD, and MSA prevention. </w:t>
+      </w:r>
+      <w:hyperlink r:id="rId25">
+        <w:r>
+          <w:rPr>
+            <w:rStyle w:val="Hyperlink"/>
+          </w:rPr>
+          <w:t>[Boeve et al., 2025]</w:t>
+        </w:r>
+      </w:hyperlink>
+    </w:p>
+    <w:p>
+      <w:pPr>
+        <w:pStyle w:val="ListBullet"/>
+      </w:pPr>
+      <w:r>
+        <w:t xml:space="preserve">Microbiome dysbiosis and increased intestinal permeability have been identified as occurring **early in prodromal Lewy body disease**, associated with α-synuclein increases and midbrain degeneration; microbiome-targeting interventions are positioned as candidates for clinical trials to prevent motor and cognitive symptom development. </w:t>
+      </w:r>
+      <w:hyperlink r:id="rId16">
+        <w:r>
+          <w:rPr>
+            <w:rStyle w:val="Hyperlink"/>
+          </w:rPr>
+          <w:t>[Ryman et al., 2025]</w:t>
+        </w:r>
+      </w:hyperlink>
+    </w:p>
+    <w:p>
+      <w:pPr>
+        <w:pStyle w:val="ListBullet"/>
+      </w:pPr>
+      <w:r>
+        <w:t xml:space="preserve">Cognitive heterogeneity in Lewy body diseases is being approached through biomarker-derived molecular leads identified as an "untapped opportunity" to uncover key pathogenic players in cognitive decline. </w:t>
+      </w:r>
+      <w:hyperlink r:id="rId13">
+        <w:r>
+          <w:rPr>
+            <w:rStyle w:val="Hyperlink"/>
+          </w:rPr>
+          <w:t>[Chen-Plotkin et al., 2025]</w:t>
+        </w:r>
+      </w:hyperlink>
+    </w:p>
+    <w:p/>
+    <w:p>
+      <w:r>
+        <w:t>────────────────────────────────────────────────────────────</w:t>
+      </w:r>
+    </w:p>
+    <w:p/>
+    <w:p>
+      <w:pPr>
+        <w:pStyle w:val="Heading3"/>
+      </w:pPr>
+      <w:r>
+        <w:t>Theme 2: Targeted Small-Molecule Drug Discovery — From Genetics to the Clinic</w:t>
+      </w:r>
+    </w:p>
+    <w:p/>
+    <w:p>
+      <w:r>
+        <w:t>A prominent 2025 grant theme is the acceleration of small-molecule therapeutics anchored to specific genetic and molecular targets, with multiple compounds now in multi-institutional development pipelines.</w:t>
+      </w:r>
+    </w:p>
+    <w:p/>
+    <w:p>
+      <w:pPr>
+        <w:pStyle w:val="ListBullet"/>
+      </w:pPr>
+      <w:r>
+        <w:t xml:space="preserve">Multi-institutional synthesis efforts are underway: **alpha-synuclein lead compound synthesis** at Penn and WUSTL, and **tau lead compound synthesis** at Pitt in collaboration with Penn, reflecting coordinated investment in two of PD's most important pathogenic proteins. </w:t>
+      </w:r>
+      <w:hyperlink r:id="rId18">
+        <w:r>
+          <w:rPr>
+            <w:rStyle w:val="Hyperlink"/>
+          </w:rPr>
+          <w:t>[Mach et al., 2025]</w:t>
+        </w:r>
+      </w:hyperlink>
+    </w:p>
+    <w:p>
+      <w:pPr>
+        <w:pStyle w:val="ListBullet"/>
+      </w:pPr>
+      <w:r>
+        <w:t xml:space="preserve">The allosteric c-Abl inhibitor **Neurotinib** has demonstrated encouraging efficacy in multiple PD models with good pharmacokinetics and preferential CNS distribution, representing one of the most advanced neuroprotective candidates in the current portfolio. </w:t>
+      </w:r>
+      <w:hyperlink r:id="rId10">
+        <w:r>
+          <w:rPr>
+            <w:rStyle w:val="Hyperlink"/>
+          </w:rPr>
+          <w:t>[Marugan et al., 2025]</w:t>
+        </w:r>
+      </w:hyperlink>
+    </w:p>
+    <w:p>
+      <w:pPr>
+        <w:pStyle w:val="ListBullet"/>
+      </w:pPr>
+      <w:r>
+        <w:t xml:space="preserve">**Non-inhibitory pharmacological chaperones targeting the GBA1 L444P variant** are in active development, reflecting growing attention to the most common genetic risk factor for PD. </w:t>
+      </w:r>
+      <w:hyperlink r:id="rId10">
+        <w:r>
+          <w:rPr>
+            <w:rStyle w:val="Hyperlink"/>
+          </w:rPr>
+          <w:t>[Marugan et al., 2025]</w:t>
+        </w:r>
+      </w:hyperlink>
+    </w:p>
+    <w:p>
+      <w:pPr>
+        <w:pStyle w:val="ListBullet"/>
+      </w:pPr>
+      <w:r>
+        <w:t xml:space="preserve">**Histone deacetylase (HDAC) inhibitors** are emerging as a therapeutic class, with epigenetics identified as a prominent research area in PD grant funding. </w:t>
+      </w:r>
+      <w:hyperlink r:id="rId24">
+        <w:r>
+          <w:rPr>
+            <w:rStyle w:val="Hyperlink"/>
+          </w:rPr>
+          <w:t>[Chen et al., 2025]</w:t>
+        </w:r>
+      </w:hyperlink>
+    </w:p>
+    <w:p>
+      <w:pPr>
+        <w:pStyle w:val="ListBullet"/>
+      </w:pPr>
+      <w:r>
+        <w:t xml:space="preserve">**Striatal CaV1.3 calcium channels** have been validated as a therapeutic target specifically for levodopa-induced dyskinesia, addressing a major quality-of-life complication of standard PD therapy. </w:t>
+      </w:r>
+      <w:hyperlink r:id="rId21">
+        <w:r>
+          <w:rPr>
+            <w:rStyle w:val="Hyperlink"/>
+          </w:rPr>
+          <w:t>[Kordower et al., 2025]</w:t>
+        </w:r>
+      </w:hyperlink>
+    </w:p>
+    <w:p>
+      <w:pPr>
+        <w:pStyle w:val="ListBullet"/>
+      </w:pPr>
+      <w:r>
+        <w:t xml:space="preserve">At the preclinical screening level, a **C. elegans quantitative high-throughput screening (qHTS)** system has been developed to evaluate siRNA libraries and investigational agents for suppression of neurodegeneration. </w:t>
+      </w:r>
+      <w:hyperlink r:id="rId26">
+        <w:r>
+          <w:rPr>
+            <w:rStyle w:val="Hyperlink"/>
+          </w:rPr>
+          <w:t>[Inglese et al., 2025]</w:t>
+        </w:r>
+      </w:hyperlink>
+    </w:p>
+    <w:p/>
+    <w:p>
+      <w:r>
+        <w:t>────────────────────────────────────────────────────────────</w:t>
+      </w:r>
+    </w:p>
+    <w:p/>
+    <w:p>
+      <w:pPr>
+        <w:pStyle w:val="Heading3"/>
+      </w:pPr>
+      <w:r>
+        <w:t>Theme 3: Biomarker Development — Blood, Imaging, and Molecular Platforms</w:t>
+      </w:r>
+    </w:p>
+    <w:p/>
+    <w:p>
+      <w:r>
+        <w:t>The 2025 grant landscape reflects major investment in building a multi-modal biomarker infrastructure capable of detecting and staging PD across the disease continuum, including the prodromal phase.</w:t>
+      </w:r>
+    </w:p>
+    <w:p/>
+    <w:p>
+      <w:pPr>
+        <w:pStyle w:val="ListBullet"/>
+      </w:pPr>
+      <w:r>
+        <w:t xml:space="preserve">**Blood-based extracellular vesicle (EV) immunoaffinity isolation technology** is being developed to detect synucleinopathies with high sensitivity—a potential breakthrough for accessible, minimally invasive clinical identification of at-risk patients. </w:t>
+      </w:r>
+      <w:hyperlink r:id="rId11">
+        <w:r>
+          <w:rPr>
+            <w:rStyle w:val="Hyperlink"/>
+          </w:rPr>
+          <w:t>[Eitan et al., 2025]</w:t>
+        </w:r>
+      </w:hyperlink>
+    </w:p>
+    <w:p>
+      <w:pPr>
+        <w:pStyle w:val="ListBullet"/>
+      </w:pPr>
+      <w:r>
+        <w:t xml:space="preserve">**7T MRI subject-specific models** of anatomical and functional connectivity are being developed at the UMN Udall Center to support multiple PD research projects, pushing neuroimaging resolution and precision. </w:t>
+      </w:r>
+      <w:hyperlink r:id="rId12">
+        <w:r>
+          <w:rPr>
+            <w:rStyle w:val="Hyperlink"/>
+          </w:rPr>
+          <w:t>[Harel et al., 2025]</w:t>
+        </w:r>
+      </w:hyperlink>
+    </w:p>
+    <w:p>
+      <w:pPr>
+        <w:pStyle w:val="ListBullet"/>
+      </w:pPr>
+      <w:r>
+        <w:t xml:space="preserve">**MRI research** is being applied to distinguish between iron and myelin contributions to contrast changes, enabling more precise characterization of neurodegeneration pathology in PD. </w:t>
+      </w:r>
+      <w:hyperlink r:id="rId27">
+        <w:r>
+          <w:rPr>
+            <w:rStyle w:val="Hyperlink"/>
+          </w:rPr>
+          <w:t>[Duyn et al., 2025]</w:t>
+        </w:r>
+      </w:hyperlink>
+    </w:p>
+    <w:p>
+      <w:pPr>
+        <w:pStyle w:val="ListBullet"/>
+      </w:pPr>
+      <w:r>
+        <w:t xml:space="preserve">**Genome-wide prediction of dementia in PD** is being pursued with a focus on disease progression rather than susceptibility, reflecting recognition that progression—not onset—is the primary determinant of patient well-being. </w:t>
+      </w:r>
+      <w:hyperlink r:id="rId28">
+        <w:r>
+          <w:rPr>
+            <w:rStyle w:val="Hyperlink"/>
+          </w:rPr>
+          <w:t>[Scherzer et al., 2025]</w:t>
+        </w:r>
+      </w:hyperlink>
+    </w:p>
+    <w:p>
+      <w:pPr>
+        <w:pStyle w:val="ListBullet"/>
+      </w:pPr>
+      <w:r>
+        <w:t xml:space="preserve">**Biomarker screening approaches** are being used to uncover molecular correlates of cognitive heterogeneity in Lewy body diseases. </w:t>
+      </w:r>
+      <w:hyperlink r:id="rId13">
+        <w:r>
+          <w:rPr>
+            <w:rStyle w:val="Hyperlink"/>
+          </w:rPr>
+          <w:t>[Chen-Plotkin et al., 2025]</w:t>
+        </w:r>
+      </w:hyperlink>
+    </w:p>
+    <w:p>
+      <w:pPr>
+        <w:pStyle w:val="ListBullet"/>
+      </w:pPr>
+      <w:r>
+        <w:t xml:space="preserve">**Alpha-synuclein strain properties** are associated with progression to PD with dementia, creating a potential strain-typing biomarker opportunity. </w:t>
+      </w:r>
+      <w:hyperlink r:id="rId17">
+        <w:r>
+          <w:rPr>
+            <w:rStyle w:val="Hyperlink"/>
+          </w:rPr>
+          <w:t>[Mao et al., 2025]</w:t>
+        </w:r>
+      </w:hyperlink>
+    </w:p>
+    <w:p/>
+    <w:p>
+      <w:r>
+        <w:t>────────────────────────────────────────────────────────────</w:t>
+      </w:r>
+    </w:p>
+    <w:p/>
+    <w:p>
+      <w:pPr>
+        <w:pStyle w:val="Heading3"/>
+      </w:pPr>
+      <w:r>
+        <w:t>Theme 4: Interventional Neurology — Cell Therapy, DBS, and Clinical Trial Infrastructure</w:t>
+      </w:r>
+    </w:p>
+    <w:p/>
+    <w:p>
+      <w:r>
+        <w:t>A fourth major theme in 2025 PD grant funding is the maturation of interventional approaches—from neurostimulation refinements to cell replacement—alongside investment in the consortium and trial infrastructure needed to execute large-scale studies.</w:t>
+      </w:r>
+    </w:p>
+    <w:p/>
+    <w:p>
+      <w:pPr>
+        <w:pStyle w:val="ListBullet"/>
+      </w:pPr>
+      <w:r>
+        <w:t xml:space="preserve">A **Phase 1 clinical trial for bilateral intrastriatal grafting of human dopamine neurons derived from embryonic stem cells** has been completed in PD patients, marking a significant milestone for cell-based neuronal replacement. </w:t>
+      </w:r>
+      <w:hyperlink r:id="rId14">
+        <w:r>
+          <w:rPr>
+            <w:rStyle w:val="Hyperlink"/>
+          </w:rPr>
+          <w:t>[Tabar et al., 2025]</w:t>
+        </w:r>
+      </w:hyperlink>
+    </w:p>
+    <w:p>
+      <w:pPr>
+        <w:pStyle w:val="ListBullet"/>
+      </w:pPr>
+      <w:r>
+        <w:t xml:space="preserve">**Early deep brain stimulation (DBS)** has achieved Class II evidence of slowing rest tremor progression in early-stage PD. </w:t>
+      </w:r>
+      <w:hyperlink r:id="rId15">
+        <w:r>
+          <w:rPr>
+            <w:rStyle w:val="Hyperlink"/>
+          </w:rPr>
+          <w:t>[Hacker et al., 2025]</w:t>
+        </w:r>
+      </w:hyperlink>
+    </w:p>
+    <w:p>
+      <w:pPr>
+        <w:pStyle w:val="ListBullet"/>
+      </w:pPr>
+      <w:r>
+        <w:t xml:space="preserve">A **pilot study comparing conventional and burst DBS** in the globus pallidus internus showed equal efficacy and tolerability, opening the door to refined stimulation paradigms. </w:t>
+      </w:r>
+      <w:hyperlink r:id="rId29">
+        <w:r>
+          <w:rPr>
+            <w:rStyle w:val="Hyperlink"/>
+          </w:rPr>
+          <w:t>[Milosevic et al., 2026]</w:t>
+        </w:r>
+      </w:hyperlink>
+    </w:p>
+    <w:p>
+      <w:pPr>
+        <w:pStyle w:val="ListBullet"/>
+      </w:pPr>
+      <w:r>
+        <w:t xml:space="preserve">NIH-funded PD research is coalescing around **four programmatic priority areas**: PD neural networks, objective PD measurements, healthcare needs for older adults with neurological disorders, and leading multidisciplinary clinical trial teams. </w:t>
+      </w:r>
+      <w:hyperlink r:id="rId15">
+        <w:r>
+          <w:rPr>
+            <w:rStyle w:val="Hyperlink"/>
+          </w:rPr>
+          <w:t>[Hacker et al., 2025]</w:t>
+        </w:r>
+      </w:hyperlink>
+    </w:p>
+    <w:p>
+      <w:pPr>
+        <w:pStyle w:val="ListBullet"/>
+      </w:pPr>
+      <w:r>
+        <w:t xml:space="preserve">**Large consortium models** following the Alzheimer's disease research template are being applied to PD, leveraging multiple centers with standardized approaches to accelerate discovery. </w:t>
+      </w:r>
+      <w:hyperlink r:id="rId30">
+        <w:r>
+          <w:rPr>
+            <w:rStyle w:val="Hyperlink"/>
+          </w:rPr>
+          <w:t>[Galask et al., 2025]</w:t>
+        </w:r>
+      </w:hyperlink>
+    </w:p>
+    <w:p>
+      <w:pPr>
+        <w:pStyle w:val="ListBullet"/>
+      </w:pPr>
+      <w:r>
+        <w:t xml:space="preserve">**CEP-1347**, an MLK family inhibitor, completed a clinical trial in PD with no collateral toxicity, providing safety data that informs the kinase inhibitor pipeline. </w:t>
+      </w:r>
+      <w:hyperlink r:id="rId31">
+        <w:r>
+          <w:rPr>
+            <w:rStyle w:val="Hyperlink"/>
+          </w:rPr>
+          <w:t>[Rana et al., 2026]</w:t>
+        </w:r>
+      </w:hyperlink>
+    </w:p>
+    <w:p/>
+    <w:p>
+      <w:r>
+        <w:t>────────────────────────────────────────────────────────────</w:t>
+      </w:r>
+    </w:p>
+    <w:p/>
+    <w:p>
+      <w:pPr>
+        <w:pStyle w:val="Heading3"/>
+      </w:pPr>
+      <w:r>
+        <w:t>Theme 5: Neuroinflammation, Glial Biology, and Systems-Level Mechanisms</w:t>
+      </w:r>
+    </w:p>
+    <w:p/>
+    <w:p>
+      <w:r>
+        <w:t>An emerging cross-cutting theme in 2025 grant funding is the role of non-neuronal cells and inflammatory pathways in PD pathogenesis—an area that bridges basic mechanistic research with therapeutic opportunity.</w:t>
+      </w:r>
+    </w:p>
+    <w:p/>
+    <w:p>
+      <w:pPr>
+        <w:pStyle w:val="ListBullet"/>
+      </w:pPr>
+      <w:r>
+        <w:t xml:space="preserve">**Glia** are identified as playing an important role in neurodegeneration, with genetic analysis studies highlighted as having significant potential impact on understanding PD mechanisms. </w:t>
+      </w:r>
+      <w:hyperlink r:id="rId32">
+        <w:r>
+          <w:rPr>
+            <w:rStyle w:val="Hyperlink"/>
+          </w:rPr>
+          <w:t>[Feany, 2025]</w:t>
+        </w:r>
+      </w:hyperlink>
+    </w:p>
+    <w:p>
+      <w:pPr>
+        <w:pStyle w:val="ListBullet"/>
+      </w:pPr>
+      <w:r>
+        <w:t xml:space="preserve">**TBK1** functions at the intersection of two key pathways—**PINK1/Parkin-mediated mitophagy** and **STING-mediated innate immunity**—placing neuroinflammation directly within the mitochondrial quality control framework. </w:t>
+      </w:r>
+      <w:hyperlink r:id="rId20">
+        <w:r>
+          <w:rPr>
+            <w:rStyle w:val="Hyperlink"/>
+          </w:rPr>
+          <w:t>[Youle, 2025]</w:t>
+        </w:r>
+      </w:hyperlink>
+    </w:p>
+    <w:p>
+      <w:pPr>
+        <w:pStyle w:val="ListBullet"/>
+      </w:pPr>
+      <w:r>
+        <w:t xml:space="preserve">**LRRK2 interaction with 14-3-3 proteins** represents a molecular interface relevant to PD pathogenesis, with implications for both understanding disease and designing targeted therapies. </w:t>
+      </w:r>
+      <w:hyperlink r:id="rId19">
+        <w:r>
+          <w:rPr>
+            <w:rStyle w:val="Hyperlink"/>
+          </w:rPr>
+          <w:t>[Cookson et al., 2025]</w:t>
+        </w:r>
+      </w:hyperlink>
+    </w:p>
+    <w:p>
+      <w:pPr>
+        <w:pStyle w:val="ListBullet"/>
+      </w:pPr>
+      <w:r>
+        <w:t xml:space="preserve">**Cholinergic system degeneration** is demonstrating prominent and dynamic impacts on both gait and cognitive abnormalities in PD, underscoring the multi-neurotransmitter complexity of the disease. </w:t>
+      </w:r>
+      <w:hyperlink r:id="rId33">
+        <w:r>
+          <w:rPr>
+            <w:rStyle w:val="Hyperlink"/>
+          </w:rPr>
+          <w:t>[Albin et al., 2025]</w:t>
+        </w:r>
+      </w:hyperlink>
+    </w:p>
+    <w:p>
+      <w:pPr>
+        <w:pStyle w:val="ListBullet"/>
+      </w:pPr>
+      <w:r>
+        <w:t xml:space="preserve">**Protein aggregation** is identified as a key research direction, with the field described as at "an energetic moment of progress." </w:t>
+      </w:r>
+      <w:hyperlink r:id="rId34">
+        <w:r>
+          <w:rPr>
+            <w:rStyle w:val="Hyperlink"/>
+          </w:rPr>
+          <w:t>[Joachimiak et al., 2025]</w:t>
+        </w:r>
+      </w:hyperlink>
+    </w:p>
+    <w:p>
+      <w:pPr>
+        <w:pStyle w:val="ListBullet"/>
+      </w:pPr>
+      <w:r>
+        <w:t xml:space="preserve">**Health disparities** represent an emerging theme: racial differences in PD clinical phenotype, patient-reported outcomes, and disease recognition/management in Black patients are being studied with implications for equitable healthcare delivery. </w:t>
+      </w:r>
+      <w:hyperlink r:id="rId35">
+        <w:r>
+          <w:rPr>
+            <w:rStyle w:val="Hyperlink"/>
+          </w:rPr>
+          <w:t>[Hall et al., 2025]</w:t>
+        </w:r>
+      </w:hyperlink>
+    </w:p>
+    <w:p/>
+    <w:p>
+      <w:r>
+        <w:t>────────────────────────────────────────────────────────────</w:t>
+      </w:r>
+    </w:p>
+    <w:p/>
+    <w:p>
+      <w:pPr>
+        <w:pStyle w:val="Heading2"/>
+      </w:pPr>
+      <w:r>
+        <w:t>Research Gaps &amp; White Space</w:t>
+      </w:r>
+    </w:p>
+    <w:p/>
+    <w:p>
+      <w:r>
+        <w:t>Based on what the verified findings reveal—and more importantly, what they do not—the following gaps are notable for a program officer evaluating the 2025 PD funding landscape:</w:t>
+      </w:r>
+    </w:p>
+    <w:p/>
+    <w:p>
+      <w:r>
+        <w:t xml:space="preserve">1. **AI and digital biomarkers are absent from the verified findings.** Despite growing interest in wearable sensors, smartphone-based gait analysis, and machine learning for PD diagnosis and monitoring, none of the verified grant abstracts surface these approaches. This is a conspicuous absence given that "objective PD measurements" is named as a NIH priority area </w:t>
+      </w:r>
+      <w:hyperlink r:id="rId15">
+        <w:r>
+          <w:rPr>
+            <w:rStyle w:val="Hyperlink"/>
+          </w:rPr>
+          <w:t>[Hacker et al., 2025]</w:t>
+        </w:r>
+      </w:hyperlink>
+      <w:r>
+        <w:t xml:space="preserve"> but no specific digital health grants are documented in the data.</w:t>
+      </w:r>
+    </w:p>
+    <w:p/>
+    <w:p>
+      <w:r>
+        <w:t>2. **Environmental and lifestyle risk factors are not represented.** The findings contain no grants addressing pesticide exposure, air pollution, physical activity, or other modifiable environmental risk factors for PD—an area of active epidemiological interest that appears absent from the 2025 portfolio as captured here.</w:t>
+      </w:r>
+    </w:p>
+    <w:p/>
+    <w:p>
+      <w:r>
+        <w:t>3. **Sex and gender differences in PD are not addressed.** Despite known differences in PD incidence, presentation, and drug response between males and females, no verified findings address sex-stratified analyses or mechanisms of sex-based vulnerability.</w:t>
+      </w:r>
+    </w:p>
+    <w:p/>
+    <w:p>
+      <w:r>
+        <w:t xml:space="preserve">4. **Non-motor symptom therapeutics (beyond cognition) are underrepresented.** While cognitive decline receives attention </w:t>
+      </w:r>
+      <w:r>
+        <w:t>[Chen-Plotkin et al., 2025; Scherzer et al., 2025]</w:t>
+      </w:r>
+      <w:r>
+        <w:t>, other non-motor symptoms such as autonomic dysfunction, depression, pain, and fatigue—which dominate patient quality-of-life concerns—are not surfaced in the funded grant abstracts.</w:t>
+      </w:r>
+    </w:p>
+    <w:p/>
+    <w:p>
+      <w:r>
+        <w:t>5. **Gene therapy and antisense oligonucleotides (ASOs) are missing.** Despite their rapid clinical advancement in other neurological diseases (e.g., SMA, HD), no verified findings document ASO or AAV-based gene therapy grants specifically for PD in 2025, which may represent a gap in the captured data or an investment lag.</w:t>
+      </w:r>
+    </w:p>
+    <w:p/>
+    <w:p>
+      <w:r>
+        <w:t>6. **Health economics and implementation science are absent.** The user's question about emerging themes could encompass how PD care is being delivered and funded at scale; the grant data contains no findings on cost-effectiveness, health systems research, or real-world implementation of PD interventions.</w:t>
+      </w:r>
+    </w:p>
+    <w:p/>
+    <w:p>
+      <w:r>
+        <w:t xml:space="preserve">7. **Longitudinal cohort infrastructure beyond prodromal RBD is underrepresented.** While the NAPS2 consortium </w:t>
+      </w:r>
+      <w:hyperlink r:id="rId25">
+        <w:r>
+          <w:rPr>
+            <w:rStyle w:val="Hyperlink"/>
+          </w:rPr>
+          <w:t>[Boeve et al., 2025]</w:t>
+        </w:r>
+      </w:hyperlink>
+      <w:r>
+        <w:t xml:space="preserve"> addresses one prodromal population, the broader question of how diverse PD cohorts (e.g., MJFF PPMI, de novo PD) are being leveraged in 2025 is not answered by the current data.</w:t>
       </w:r>
     </w:p>
     <w:p/>
@@ -163,2423 +1978,57 @@
         <w:pStyle w:val="Heading2"/>
       </w:pPr>
       <w:r>
-        <w:t>2. Major Research Themes</w:t>
-      </w:r>
-    </w:p>
-    <w:p/>
-    <w:p>
-      <w:pPr>
-        <w:pStyle w:val="Heading3"/>
-      </w:pPr>
-      <w:r>
-        <w:t>2.1 Alpha-Synuclein Pathobiology and Prion-Like Propagation</w:t>
+        <w:t>Strategic Summary</w:t>
       </w:r>
     </w:p>
     <w:p/>
     <w:p>
       <w:r>
-        <w:t xml:space="preserve">Alpha-synuclein (α-syn) aggregation is a defining molecular hallmark of PD and related synucleinopathies. α-Synuclein aggregates to form insoluble fibrils in pathological conditions characterized by Lewy bodies, including PD, MSA, and DLB </w:t>
+        <w:t xml:space="preserve">The single most important insight from this data is that **NIH PD grant funding in 2025 is structurally organized around disease modification before and at early symptom onset**—with prodromal characterization declared the top clinical priority </w:t>
       </w:r>
-      <w:hyperlink r:id="rId14">
+      <w:hyperlink r:id="rId9">
         <w:r>
           <w:rPr>
             <w:rStyle w:val="Hyperlink"/>
           </w:rPr>
-          <w:t>[Jaffee, 2025]</w:t>
+          <w:t>[Ascherio et al., 2025-2026]</w:t>
         </w:r>
       </w:hyperlink>
       <w:r>
-        <w:t xml:space="preserve">. Pathologic accumulation of misfolded α-synuclein in neurons leads to neurodegeneration, cognitive dysfunction, and dementia in α-synucleinopathies </w:t>
+        <w:t xml:space="preserve"> and the drug development pipeline increasingly anchored to validated genetic targets (GBA1, LRRK2, c-Abl) rather than symptomatic relief. A well-targeted next investment would be at the **convergence of prodromal biomarker platforms and mechanism-targeted prevention trials**: specifically, supporting studies that connect blood-based EV biomarkers </w:t>
+      </w:r>
+      <w:hyperlink r:id="rId11">
+        <w:r>
+          <w:rPr>
+            <w:rStyle w:val="Hyperlink"/>
+          </w:rPr>
+          <w:t>[Eitan et al., 2025]</w:t>
+        </w:r>
+      </w:hyperlink>
+      <w:r>
+        <w:t xml:space="preserve"> or microbiome signatures </w:t>
+      </w:r>
+      <w:hyperlink r:id="rId16">
+        <w:r>
+          <w:rPr>
+            <w:rStyle w:val="Hyperlink"/>
+          </w:rPr>
+          <w:t>[Ryman et al., 2025]</w:t>
+        </w:r>
+      </w:hyperlink>
+      <w:r>
+        <w:t xml:space="preserve"> with early intervention in RBD or other prodromal cohorts, thereby creating the biomarker-enriched trial infrastructure NINDS has identified as critical but which the current portfolio has not yet fully closed. Funding that also addresses the identified gap in digital/objective outcome measures would directly enable the multidisciplinary clinical trial agenda </w:t>
       </w:r>
       <w:hyperlink r:id="rId15">
         <w:r>
           <w:rPr>
             <w:rStyle w:val="Hyperlink"/>
           </w:rPr>
-          <w:t>[Dawson, 2025]</w:t>
+          <w:t>[Hacker et al., 2025]</w:t>
         </w:r>
       </w:hyperlink>
       <w:r>
-        <w:t xml:space="preserve">. Disease-associated pathological aggregates of α-synuclein exhibit prion-like spreading in synucleinopathies such as PD and DLB </w:t>
-      </w:r>
-      <w:hyperlink r:id="rId16">
-        <w:r>
-          <w:rPr>
-            <w:rStyle w:val="Hyperlink"/>
-          </w:rPr>
-          <w:t>[Caughey, 2025]</w:t>
-        </w:r>
-      </w:hyperlink>
-      <w:r>
-        <w:t>.</w:t>
-      </w:r>
-    </w:p>
-    <w:p/>
-    <w:p>
-      <w:r>
-        <w:t xml:space="preserve">The gut-brain axis has emerged as a critical propagation route: α-synuclein protein misfolding in PD implies propagation from the gut to brainstem via the vagus nerve, and α-syn oligomers in CSF serve as a marker of early synucleinopathies </w:t>
-      </w:r>
-      <w:hyperlink r:id="rId17">
-        <w:r>
-          <w:rPr>
-            <w:rStyle w:val="Hyperlink"/>
-          </w:rPr>
-          <w:t>[Camilleri, 2025]</w:t>
-        </w:r>
-      </w:hyperlink>
-      <w:r>
-        <w:t xml:space="preserve">. Notably, α-synuclein aggregates are identified in enteric neurons in elderly people without PD </w:t>
-      </w:r>
-      <w:hyperlink r:id="rId17">
-        <w:r>
-          <w:rPr>
-            <w:rStyle w:val="Hyperlink"/>
-          </w:rPr>
-          <w:t>[Michael L. Camilleri, 2025]</w:t>
-        </w:r>
-      </w:hyperlink>
-      <w:r>
-        <w:t xml:space="preserve">, suggesting early subclinical pathology. In Lewy body diseases, there is increased deposition of α-synuclein in cutaneous sympathetic noradrenergic nerves </w:t>
-      </w:r>
-      <w:hyperlink r:id="rId18">
-        <w:r>
-          <w:rPr>
-            <w:rStyle w:val="Hyperlink"/>
-          </w:rPr>
-          <w:t>[Goldstein, 2025]</w:t>
-        </w:r>
-      </w:hyperlink>
-      <w:r>
-        <w:t xml:space="preserve">, and α-synuclein has pathophysiologic significance in sympathetic nerves more broadly </w:t>
-      </w:r>
-      <w:hyperlink r:id="rId18">
-        <w:r>
-          <w:rPr>
-            <w:rStyle w:val="Hyperlink"/>
-          </w:rPr>
-          <w:t>[Isonaka &amp; Goldstein, 2025]</w:t>
-        </w:r>
-      </w:hyperlink>
-      <w:r>
-        <w:t>.</w:t>
-      </w:r>
-    </w:p>
-    <w:p/>
-    <w:p>
-      <w:r>
-        <w:t xml:space="preserve">At the molecular level, blocking phosphorylation of alpha synuclein via a Plk2 inhibitor changes neuronal electrical activity in cells without pathology </w:t>
-      </w:r>
-      <w:hyperlink r:id="rId19">
-        <w:r>
-          <w:rPr>
-            <w:rStyle w:val="Hyperlink"/>
-          </w:rPr>
-          <w:t>[Cookson, 2025]</w:t>
-        </w:r>
-      </w:hyperlink>
-      <w:r>
-        <w:t xml:space="preserve">, and cells with the greatest amount of phosphorylated synuclein tend to have higher expression of the stress-responsive kinase Plk2 </w:t>
-      </w:r>
-      <w:hyperlink r:id="rId19">
-        <w:r>
-          <w:rPr>
-            <w:rStyle w:val="Hyperlink"/>
-          </w:rPr>
-          <w:t>[Cookson, 2025]</w:t>
-        </w:r>
-      </w:hyperlink>
-      <w:r>
-        <w:t xml:space="preserve">. Disease-associated α-synuclein disrupts trafficking, whereas palmitoylation facilitates normal trafficking </w:t>
-      </w:r>
-      <w:hyperlink r:id="rId20">
-        <w:r>
-          <w:rPr>
-            <w:rStyle w:val="Hyperlink"/>
-          </w:rPr>
-          <w:t>[Ho, 2025]</w:t>
-        </w:r>
-      </w:hyperlink>
-      <w:r>
-        <w:t xml:space="preserve">. In DLB and PD at autopsy, histone acetylation is markedly dysregulated </w:t>
-      </w:r>
-      <w:hyperlink r:id="rId21">
-        <w:r>
-          <w:rPr>
-            <w:rStyle w:val="Hyperlink"/>
-          </w:rPr>
-          <w:t>[Stephen N. Gomperts, 2025]</w:t>
-        </w:r>
-      </w:hyperlink>
-      <w:r>
-        <w:t xml:space="preserve">. Molecular dynamic studies on α-synuclein proteins can provide theoretical understanding of conformational changes in PD research </w:t>
-      </w:r>
-      <w:hyperlink r:id="rId22">
-        <w:r>
-          <w:rPr>
-            <w:rStyle w:val="Hyperlink"/>
-          </w:rPr>
-          <w:t>[Liu, 2025]</w:t>
-        </w:r>
-      </w:hyperlink>
-      <w:r>
-        <w:t xml:space="preserve">, and a label-free, non-invasive, and non-destructive approach has been developed to determine the structural organization of individual α-Syn aggregates </w:t>
-      </w:r>
-      <w:hyperlink r:id="rId23">
-        <w:r>
-          <w:rPr>
-            <w:rStyle w:val="Hyperlink"/>
-          </w:rPr>
-          <w:t>[Kurouski, 2025]</w:t>
-        </w:r>
-      </w:hyperlink>
-      <w:r>
-        <w:t>.</w:t>
-      </w:r>
-    </w:p>
-    <w:p/>
-    <w:p>
-      <w:r>
-        <w:t>────────────────────────────────────────────────────────────</w:t>
-      </w:r>
-    </w:p>
-    <w:p/>
-    <w:p>
-      <w:pPr>
-        <w:pStyle w:val="Heading3"/>
-      </w:pPr>
-      <w:r>
-        <w:t>2.2 Neuroinflammation and Glial Biology</w:t>
-      </w:r>
-    </w:p>
-    <w:p/>
-    <w:p>
-      <w:r>
-        <w:t xml:space="preserve">Neuroinflammation is a key element in the pathogenesis and progression of PD </w:t>
-      </w:r>
-      <w:hyperlink r:id="rId24">
-        <w:r>
-          <w:rPr>
-            <w:rStyle w:val="Hyperlink"/>
-          </w:rPr>
-          <w:t>[Perlmutter, 2025]</w:t>
-        </w:r>
-      </w:hyperlink>
-      <w:r>
-        <w:t xml:space="preserve">. Immune activation either causes or contributes to the pathogenesis of PD as a neuroinflammatory disorder </w:t>
-      </w:r>
-      <w:hyperlink r:id="rId25">
-        <w:r>
-          <w:rPr>
-            <w:rStyle w:val="Hyperlink"/>
-          </w:rPr>
-          <w:t>[Paulovich, 2025]</w:t>
-        </w:r>
-      </w:hyperlink>
-      <w:r>
-        <w:t xml:space="preserve">. Signs of inflammation have been detected in postmortem tissue of PD patients, and mutations in genes associated with familial PD can influence the function of astrocytes and microglia </w:t>
-      </w:r>
-      <w:hyperlink r:id="rId26">
-        <w:r>
-          <w:rPr>
-            <w:rStyle w:val="Hyperlink"/>
-          </w:rPr>
-          <w:t>[Cowell, 2025]</w:t>
-        </w:r>
-      </w:hyperlink>
-      <w:r>
-        <w:t xml:space="preserve">. However, direct evidence is lacking for mechanistic links among inflammation, glial dysregulation, and the neuronal loss characteristic of PD </w:t>
-      </w:r>
-      <w:hyperlink r:id="rId26">
-        <w:r>
-          <w:rPr>
-            <w:rStyle w:val="Hyperlink"/>
-          </w:rPr>
-          <w:t>[Cowell et al., 2025]</w:t>
-        </w:r>
-      </w:hyperlink>
-      <w:r>
-        <w:t>.</w:t>
-      </w:r>
-    </w:p>
-    <w:p/>
-    <w:p>
-      <w:r>
-        <w:t xml:space="preserve">At the molecular level, NF-κB and MAPK signaling result in upregulated inflammation in the brainstem vocal pathway in the Pink1-/- rat model of preclinical PD </w:t>
-      </w:r>
-      <w:hyperlink r:id="rId27">
-        <w:r>
-          <w:rPr>
-            <w:rStyle w:val="Hyperlink"/>
-          </w:rPr>
-          <w:t>[Kelm-Nelson, 2025]</w:t>
-        </w:r>
-      </w:hyperlink>
-      <w:r>
-        <w:t xml:space="preserve">. NOX2 can be activated by mitochondrially-derived ROS in a RIRP manner, which serves to greatly amplify ROS production, creating a feedforward cycle where NOX2 plays an essential amplification role in PD pathogenesis </w:t>
-      </w:r>
-      <w:hyperlink r:id="rId28">
-        <w:r>
-          <w:rPr>
-            <w:rStyle w:val="Hyperlink"/>
-          </w:rPr>
-          <w:t>[Di Maio et al., 2025]</w:t>
-        </w:r>
-      </w:hyperlink>
-      <w:r>
-        <w:t xml:space="preserve">. Other NOX isoforms, including isoforms 1 and 4, are highly expressed in brain and might contribute to the pathogenic process in PD </w:t>
-      </w:r>
-      <w:hyperlink r:id="rId28">
-        <w:r>
-          <w:rPr>
-            <w:rStyle w:val="Hyperlink"/>
-          </w:rPr>
-          <w:t>[Di Maio et al., 2025]</w:t>
-        </w:r>
-      </w:hyperlink>
-      <w:r>
-        <w:t xml:space="preserve">. PD-linked single-nucleotide polymorphisms in CD38 are associated with approximately 45% reduction in CD38 transcript expression in the human brain </w:t>
-      </w:r>
-      <w:hyperlink r:id="rId26">
-        <w:r>
-          <w:rPr>
-            <w:rStyle w:val="Hyperlink"/>
-          </w:rPr>
-          <w:t>[Cowell, 2025]</w:t>
-        </w:r>
-      </w:hyperlink>
-      <w:r>
-        <w:t xml:space="preserve">, and CD38 expression is enriched in astrocytes of the human and mouse brain </w:t>
-      </w:r>
-      <w:hyperlink r:id="rId26">
-        <w:r>
-          <w:rPr>
-            <w:rStyle w:val="Hyperlink"/>
-          </w:rPr>
-          <w:t>[Cowell, 2025]</w:t>
-        </w:r>
-      </w:hyperlink>
-      <w:r>
-        <w:t>.</w:t>
-      </w:r>
-    </w:p>
-    <w:p/>
-    <w:p>
-      <w:r>
-        <w:t xml:space="preserve">S1PR1 is the most abundant receptor in the S1P receptor family and is expressed in neurons and glial cells including astrocytes, microglia, and oligodendrocytes in the CNS </w:t>
-      </w:r>
-      <w:hyperlink r:id="rId24">
-        <w:r>
-          <w:rPr>
-            <w:rStyle w:val="Hyperlink"/>
-          </w:rPr>
-          <w:t>[Perlmutter et al., 2025]</w:t>
-        </w:r>
-      </w:hyperlink>
-      <w:r>
-        <w:t xml:space="preserve">. Neurotinib treatment significantly decreased midbrain phosphorylated c-Abl and α-synuclein levels and reduced microglia and astrocyte activation </w:t>
-      </w:r>
-      <w:hyperlink r:id="rId29">
-        <w:r>
-          <w:rPr>
-            <w:rStyle w:val="Hyperlink"/>
-          </w:rPr>
-          <w:t>[Marugan, 2025]</w:t>
-        </w:r>
-      </w:hyperlink>
-      <w:r>
-        <w:t xml:space="preserve">. Unregulated inflammation contributes to the development of PD and Alzheimer disease </w:t>
-      </w:r>
-      <w:hyperlink r:id="rId30">
-        <w:r>
-          <w:rPr>
-            <w:rStyle w:val="Hyperlink"/>
-          </w:rPr>
-          <w:t>[Altan-Bonnet, 2025]</w:t>
-        </w:r>
-      </w:hyperlink>
-      <w:r>
-        <w:t>.</w:t>
-      </w:r>
-    </w:p>
-    <w:p/>
-    <w:p>
-      <w:r>
-        <w:t>────────────────────────────────────────────────────────────</w:t>
-      </w:r>
-    </w:p>
-    <w:p/>
-    <w:p>
-      <w:pPr>
-        <w:pStyle w:val="Heading3"/>
-      </w:pPr>
-      <w:r>
-        <w:t>2.3 Mitochondrial Dysfunction</w:t>
-      </w:r>
-    </w:p>
-    <w:p/>
-    <w:p>
-      <w:r>
-        <w:t xml:space="preserve">Mitochondrial dysfunction plays a role in the pathogenesis of age-related neurodegenerative disorders, including PD and Alzheimer disease </w:t>
-      </w:r>
-      <w:hyperlink r:id="rId31">
-        <w:r>
-          <w:rPr>
-            <w:rStyle w:val="Hyperlink"/>
-          </w:rPr>
-          <w:t>[Manfredi, 2025]</w:t>
-        </w:r>
-      </w:hyperlink>
-      <w:r>
-        <w:t xml:space="preserve">. Idiopathic PD is associated with oxidative stress and mitochondrial dysfunction, particularly in relation to LRRK2 </w:t>
-      </w:r>
-      <w:hyperlink r:id="rId32">
-        <w:r>
-          <w:rPr>
-            <w:rStyle w:val="Hyperlink"/>
-          </w:rPr>
-          <w:t>[Greenamyre, 2025]</w:t>
-        </w:r>
-      </w:hyperlink>
-      <w:r>
-        <w:t xml:space="preserve">. DJ-1 mutations affect how cells respond to mitochondrial damage, with a relationship between oxidative stress and DJ-1 mitochondrial localization </w:t>
-      </w:r>
-      <w:hyperlink r:id="rId19">
-        <w:r>
-          <w:rPr>
-            <w:rStyle w:val="Hyperlink"/>
-          </w:rPr>
-          <w:t>[Cookson, 2025]</w:t>
-        </w:r>
-      </w:hyperlink>
-      <w:r>
-        <w:t xml:space="preserve">. Sustained mitochondrial integrated stress responses become maladaptive and cause imbalances of key metabolites, which may be more detrimental than the energy defect itself </w:t>
-      </w:r>
-      <w:hyperlink r:id="rId31">
-        <w:r>
-          <w:rPr>
-            <w:rStyle w:val="Hyperlink"/>
-          </w:rPr>
-          <w:t>[Manfredi, 2025]</w:t>
-        </w:r>
-      </w:hyperlink>
-      <w:r>
-        <w:t xml:space="preserve">. Research groups have accumulated over two decades of expertise in studying mechanisms of mitochondrial encephalopathies and mitochondrial dysfunction in neurodegeneration </w:t>
-      </w:r>
-      <w:hyperlink r:id="rId31">
-        <w:r>
-          <w:rPr>
-            <w:rStyle w:val="Hyperlink"/>
-          </w:rPr>
-          <w:t>[Manfredi, 2025]</w:t>
-        </w:r>
-      </w:hyperlink>
-      <w:r>
-        <w:t>.</w:t>
-      </w:r>
-    </w:p>
-    <w:p/>
-    <w:p>
-      <w:r>
-        <w:t>────────────────────────────────────────────────────────────</w:t>
-      </w:r>
-    </w:p>
-    <w:p/>
-    <w:p>
-      <w:pPr>
-        <w:pStyle w:val="Heading3"/>
-      </w:pPr>
-      <w:r>
-        <w:t>2.4 Genetic Risk Architecture and Familial PD</w:t>
-      </w:r>
-    </w:p>
-    <w:p/>
-    <w:p>
-      <w:r>
-        <w:t xml:space="preserve">The genetic landscape of PD is increasingly complex. Regulatory variation in the chromatin and transcriptional landscapes of dopaminergic neurons confers risk for Parkinson disease </w:t>
-      </w:r>
-      <w:hyperlink r:id="rId33">
-        <w:r>
-          <w:rPr>
-            <w:rStyle w:val="Hyperlink"/>
-          </w:rPr>
-          <w:t>[McCallion, 2025]</w:t>
-        </w:r>
-      </w:hyperlink>
-      <w:r>
-        <w:t xml:space="preserve">. PD-associated functional variation was identified falling within novel enhancers in dopamine neurons </w:t>
-      </w:r>
-      <w:hyperlink r:id="rId33">
-        <w:r>
-          <w:rPr>
-            <w:rStyle w:val="Hyperlink"/>
-          </w:rPr>
-          <w:t>[McCAllion, 2025]</w:t>
-        </w:r>
-      </w:hyperlink>
-      <w:r>
-        <w:t xml:space="preserve">, and PD GWAS genes are enriched in glial cells of the mouse brain </w:t>
-      </w:r>
-      <w:hyperlink r:id="rId26">
-        <w:r>
-          <w:rPr>
-            <w:rStyle w:val="Hyperlink"/>
-          </w:rPr>
-          <w:t>[Cowell, 2025]</w:t>
-        </w:r>
-      </w:hyperlink>
-      <w:r>
-        <w:t xml:space="preserve">. Splicing errors associated with alternative usage of splice sites are implicated in early-onset PD through cryptic splice site usage </w:t>
-      </w:r>
-      <w:hyperlink r:id="rId34">
-        <w:r>
-          <w:rPr>
-            <w:rStyle w:val="Hyperlink"/>
-          </w:rPr>
-          <w:t>[Duran, 2025]</w:t>
-        </w:r>
-      </w:hyperlink>
-      <w:r>
-        <w:t>.</w:t>
-      </w:r>
-    </w:p>
-    <w:p/>
-    <w:p>
-      <w:r>
-        <w:t xml:space="preserve">LRRK2 mutations in the GTP-binding region result in higher kinase activity, lower binding to 14-3-3, and reduced susceptibility to inactivation by 14-3-3 </w:t>
-      </w:r>
-      <w:hyperlink r:id="rId19">
-        <w:r>
-          <w:rPr>
-            <w:rStyle w:val="Hyperlink"/>
-          </w:rPr>
-          <w:t>[Cookson, 2025]</w:t>
-        </w:r>
-      </w:hyperlink>
-      <w:r>
-        <w:t xml:space="preserve">. LRRK2 kinase hyperactivity results from the same single nucleotide polymorphisms (G2019S, N2081D) that increase susceptibility to both PD and Crohn's disease </w:t>
-      </w:r>
-      <w:hyperlink r:id="rId22">
-        <w:r>
-          <w:rPr>
-            <w:rStyle w:val="Hyperlink"/>
-          </w:rPr>
-          <w:t>[Liu, 2025]</w:t>
-        </w:r>
-      </w:hyperlink>
-      <w:r>
-        <w:t xml:space="preserve">, and macrophage LRRK2 kinase activity plays a key role in gut inflammation </w:t>
-      </w:r>
-      <w:hyperlink r:id="rId22">
-        <w:r>
-          <w:rPr>
-            <w:rStyle w:val="Hyperlink"/>
-          </w:rPr>
-          <w:t>[Liu et al., 2025]</w:t>
-        </w:r>
-      </w:hyperlink>
-      <w:r>
-        <w:t xml:space="preserve">. Heterozygote variants in GBA1 are the most common genetic risk factor for PD </w:t>
-      </w:r>
-      <w:hyperlink r:id="rId35">
-        <w:r>
-          <w:rPr>
-            <w:rStyle w:val="Hyperlink"/>
-          </w:rPr>
-          <w:t>[Wincovitch, 2025]</w:t>
-        </w:r>
-      </w:hyperlink>
-      <w:r>
-        <w:t xml:space="preserve">, and mutations in glucocerebrosidase are the most frequent inherited risk factor associated with parkinsonism more broadly </w:t>
-      </w:r>
-      <w:hyperlink r:id="rId9">
-        <w:r>
-          <w:rPr>
-            <w:rStyle w:val="Hyperlink"/>
-          </w:rPr>
-          <w:t>[Sidransky, 2025]</w:t>
-        </w:r>
-      </w:hyperlink>
-      <w:r>
-        <w:t xml:space="preserve">. TMEM230-linked PD shows clinical and pathological features compatible with those in classical PD </w:t>
-      </w:r>
-      <w:hyperlink r:id="rId36">
-        <w:r>
-          <w:rPr>
-            <w:rStyle w:val="Hyperlink"/>
-          </w:rPr>
-          <w:t>[Deng et al., 2025]</w:t>
-        </w:r>
-      </w:hyperlink>
-      <w:r>
-        <w:t xml:space="preserve">, and TMEM230 is the first transmembrane protein of synaptic vesicles identified in PD to date </w:t>
-      </w:r>
-      <w:hyperlink r:id="rId36">
-        <w:r>
-          <w:rPr>
-            <w:rStyle w:val="Hyperlink"/>
-          </w:rPr>
-          <w:t>[Han-Xiang Deng, 2025]</w:t>
-        </w:r>
-      </w:hyperlink>
-      <w:r>
-        <w:t xml:space="preserve">. Pathogenic mutations in BORCS5 cause early-onset neurodegeneration with severe parkinsonism and dystonia </w:t>
-      </w:r>
-      <w:hyperlink r:id="rId37">
-        <w:r>
-          <w:rPr>
-            <w:rStyle w:val="Hyperlink"/>
-          </w:rPr>
-          <w:t>[Mencacci, 2025]</w:t>
-        </w:r>
-      </w:hyperlink>
-      <w:r>
-        <w:t>.</w:t>
-      </w:r>
-    </w:p>
-    <w:p/>
-    <w:p>
-      <w:r>
-        <w:t>────────────────────────────────────────────────────────────</w:t>
-      </w:r>
-    </w:p>
-    <w:p/>
-    <w:p>
-      <w:pPr>
-        <w:pStyle w:val="Heading3"/>
-      </w:pPr>
-      <w:r>
-        <w:t>2.5 Lysosomal and Endosomal Pathway Dysfunction</w:t>
-      </w:r>
-    </w:p>
-    <w:p/>
-    <w:p>
-      <w:r>
-        <w:t xml:space="preserve">Investigators in the field of neurodegeneration are now focusing on the role of lysosomal pathways in disease pathogenesis as a result of genetic and clinical studies of Gaucher disease and other lysosomal disorders </w:t>
-      </w:r>
-      <w:hyperlink r:id="rId9">
-        <w:r>
-          <w:rPr>
-            <w:rStyle w:val="Hyperlink"/>
-          </w:rPr>
-          <w:t>[Sidransky, 2025]</w:t>
-        </w:r>
-      </w:hyperlink>
-      <w:r>
-        <w:t xml:space="preserve">. Lysosomal dysfunction mechanisms identified in Gaucher disease have implications for understanding and treating PD </w:t>
-      </w:r>
-      <w:hyperlink r:id="rId9">
-        <w:r>
-          <w:rPr>
-            <w:rStyle w:val="Hyperlink"/>
-          </w:rPr>
-          <w:t>[Sidransky, 2025]</w:t>
-        </w:r>
-      </w:hyperlink>
-      <w:r>
-        <w:t xml:space="preserve">. Altered endolysosomal regulation contributes to aging-related diseases </w:t>
-      </w:r>
-      <w:hyperlink r:id="rId38">
-        <w:r>
-          <w:rPr>
-            <w:rStyle w:val="Hyperlink"/>
-          </w:rPr>
-          <w:t>[Jenny, 2025]</w:t>
-        </w:r>
-      </w:hyperlink>
-      <w:r>
-        <w:t>.</w:t>
-      </w:r>
-    </w:p>
-    <w:p/>
-    <w:p>
-      <w:r>
-        <w:t xml:space="preserve">PD is characterized by accumulation of insoluble protein aggregates that lead to neuronal decay </w:t>
-      </w:r>
-      <w:hyperlink r:id="rId38">
-        <w:r>
-          <w:rPr>
-            <w:rStyle w:val="Hyperlink"/>
-          </w:rPr>
-          <w:t>[Jenny, 2025]</w:t>
-        </w:r>
-      </w:hyperlink>
-      <w:r>
-        <w:t xml:space="preserve">. Lamp1 deficiency results in increased numbers of acidic organelles and elevated levels of sterols and diacylglycerols, indicating defects in endolysosomal pH regulation and lipid transport </w:t>
-      </w:r>
-      <w:hyperlink r:id="rId38">
-        <w:r>
-          <w:rPr>
-            <w:rStyle w:val="Hyperlink"/>
-          </w:rPr>
-          <w:t>[Jenny, 2025]</w:t>
-        </w:r>
-      </w:hyperlink>
-      <w:r>
-        <w:t xml:space="preserve">. BORCS5 is involved in essential aspects of lysosomal biology, and dysfunction of BORCS5 functions is central to disease pathogenesis in patients with BORCS5 mutations </w:t>
-      </w:r>
-      <w:hyperlink r:id="rId37">
-        <w:r>
-          <w:rPr>
-            <w:rStyle w:val="Hyperlink"/>
-          </w:rPr>
-          <w:t>[Mencacci, 2025]</w:t>
-        </w:r>
-      </w:hyperlink>
-      <w:r>
-        <w:t xml:space="preserve">. BORCS5-patients' cells carrying the disease-causing mutation R95Q show impaired lysosomal maturation and defects in autophagic flux </w:t>
-      </w:r>
-      <w:hyperlink r:id="rId37">
-        <w:r>
-          <w:rPr>
-            <w:rStyle w:val="Hyperlink"/>
-          </w:rPr>
-          <w:t>[Niccolo E Mencacci, 2025]</w:t>
-        </w:r>
-      </w:hyperlink>
-      <w:r>
-        <w:t xml:space="preserve">. MTMR5 functions as a potent neuronal autophagy suppressor in neurons </w:t>
-      </w:r>
-      <w:hyperlink r:id="rId39">
-        <w:r>
-          <w:rPr>
-            <w:rStyle w:val="Hyperlink"/>
-          </w:rPr>
-          <w:t>[Chua, 2025]</w:t>
-        </w:r>
-      </w:hyperlink>
-      <w:r>
-        <w:t xml:space="preserve">, and MTMR5 knockdown enhances neuronal sensitivity to autophagy induction and accelerates degradation of autophagy substrates including disease-associated and aggregate-prone proteins </w:t>
-      </w:r>
-      <w:hyperlink r:id="rId39">
-        <w:r>
-          <w:rPr>
-            <w:rStyle w:val="Hyperlink"/>
-          </w:rPr>
-          <w:t>[Jason Paul Chua, 2025]</w:t>
-        </w:r>
-      </w:hyperlink>
-      <w:r>
-        <w:t>.</w:t>
-      </w:r>
-    </w:p>
-    <w:p/>
-    <w:p>
-      <w:r>
-        <w:t xml:space="preserve">Techniques, insights, and experience gained from studies of Gaucher disease are being applied to understanding PD </w:t>
-      </w:r>
-      <w:hyperlink r:id="rId9">
-        <w:r>
-          <w:rPr>
-            <w:rStyle w:val="Hyperlink"/>
-          </w:rPr>
-          <w:t>[Sidransky, 2025]</w:t>
-        </w:r>
-      </w:hyperlink>
-      <w:r>
-        <w:t xml:space="preserve">. Most patients with Gaucher disease never develop PD, indicating that other genetic or environmental modifiers influence disease prevalence </w:t>
-      </w:r>
-      <w:hyperlink r:id="rId9">
-        <w:r>
-          <w:rPr>
-            <w:rStyle w:val="Hyperlink"/>
-          </w:rPr>
-          <w:t>[Sidransky, 2025]</w:t>
-        </w:r>
-      </w:hyperlink>
-      <w:r>
-        <w:t xml:space="preserve">. Increased risk of cognitive decline and dementia occurs in Gaucher's disease patients, related to PD-associated disorders </w:t>
-      </w:r>
-      <w:hyperlink r:id="rId33">
-        <w:r>
-          <w:rPr>
-            <w:rStyle w:val="Hyperlink"/>
-          </w:rPr>
-          <w:t>[McCallion et al., 2025]</w:t>
-        </w:r>
-      </w:hyperlink>
-      <w:r>
-        <w:t xml:space="preserve">. Small molecule drugs are being explored to enhance the delivery of mutant glucocerebrosidase to the lysosome in lysosomal disorders </w:t>
-      </w:r>
-      <w:hyperlink r:id="rId9">
-        <w:r>
-          <w:rPr>
-            <w:rStyle w:val="Hyperlink"/>
-          </w:rPr>
-          <w:t>[Sidransky, 2025]</w:t>
-        </w:r>
-      </w:hyperlink>
-      <w:r>
-        <w:t>.</w:t>
-      </w:r>
-    </w:p>
-    <w:p/>
-    <w:p>
-      <w:r>
-        <w:t>────────────────────────────────────────────────────────────</w:t>
-      </w:r>
-    </w:p>
-    <w:p/>
-    <w:p>
-      <w:pPr>
-        <w:pStyle w:val="Heading3"/>
-      </w:pPr>
-      <w:r>
-        <w:t>2.6 Dopaminergic Neuron Biology and Basal Ganglia Circuitry</w:t>
-      </w:r>
-    </w:p>
-    <w:p/>
-    <w:p>
-      <w:r>
-        <w:t xml:space="preserve">Regulatory variation in dopaminergic neurons is a central focus. Calb1+ dSPNs enhance dopamine release by disinhibiting nigrostriatal dopaminergic neurons through parvalbumin neuron inhibition in the substantia nigra pars reticulata, while Kremen1+ dSPNs suppress dopamine release through GABBR1-mediated inhibition of Aldh1a1+ dopaminergic neurons </w:t>
-      </w:r>
-      <w:hyperlink r:id="rId40">
-        <w:r>
-          <w:rPr>
-            <w:rStyle w:val="Hyperlink"/>
-          </w:rPr>
-          <w:t>[Cai, 2025]</w:t>
-        </w:r>
-      </w:hyperlink>
-      <w:r>
-        <w:t xml:space="preserve">. Proportionally higher output of the basal ganglia direct pathway compared to the indirect pathway results in hyperkinetic abnormal involuntary movements, a circuit-level hallmark of levodopa-induced dyskinesia (LID) </w:t>
-      </w:r>
-      <w:hyperlink r:id="rId13">
-        <w:r>
-          <w:rPr>
-            <w:rStyle w:val="Hyperlink"/>
-          </w:rPr>
-          <w:t>[Jaunarajs, 2025]</w:t>
-        </w:r>
-      </w:hyperlink>
-      <w:r>
-        <w:t xml:space="preserve">. A subpopulation of D1 receptor-expressing medium spiny output neurons (D1-MSNs) are transcriptionally altered by the development and stable expression of LID in animal models </w:t>
-      </w:r>
-      <w:hyperlink r:id="rId13">
-        <w:r>
-          <w:rPr>
-            <w:rStyle w:val="Hyperlink"/>
-          </w:rPr>
-          <w:t>[Jaunarajs, 2025]</w:t>
-        </w:r>
-      </w:hyperlink>
-      <w:r>
-        <w:t>.</w:t>
-      </w:r>
-    </w:p>
-    <w:p/>
-    <w:p>
-      <w:r>
-        <w:t xml:space="preserve">MIF nuclease activity is required for neurodegeneration of dopamine neurons in three orthogonal models of PD </w:t>
-      </w:r>
-      <w:hyperlink r:id="rId15">
-        <w:r>
-          <w:rPr>
-            <w:rStyle w:val="Hyperlink"/>
-          </w:rPr>
-          <w:t>[Dawson, 2025]</w:t>
-        </w:r>
-      </w:hyperlink>
-      <w:r>
-        <w:t xml:space="preserve">. Activation of poly(ADP-ribose) polymerase-1 (PARP-1) contributes to neurodegeneration induced by pathologic α-synuclein through the Parthanatos-associated apoptosis-inducing factor (AIF) </w:t>
-      </w:r>
-      <w:hyperlink r:id="rId15">
-        <w:r>
-          <w:rPr>
-            <w:rStyle w:val="Hyperlink"/>
-          </w:rPr>
-          <w:t>[Dawson, 2025]</w:t>
-        </w:r>
-      </w:hyperlink>
-      <w:r>
-        <w:t xml:space="preserve">. hiPSC-derived dopamine neurons can harbor established PD mutations for functional analysis </w:t>
-      </w:r>
-      <w:hyperlink r:id="rId33">
-        <w:r>
-          <w:rPr>
-            <w:rStyle w:val="Hyperlink"/>
-          </w:rPr>
-          <w:t>[McCallion, 2025]</w:t>
-        </w:r>
-      </w:hyperlink>
-      <w:r>
-        <w:t xml:space="preserve">, and human embryonic stem cell-derived dopamine neurons have been used in clinical trials for PD </w:t>
-      </w:r>
-      <w:hyperlink r:id="rId41">
-        <w:r>
-          <w:rPr>
-            <w:rStyle w:val="Hyperlink"/>
-          </w:rPr>
-          <w:t>[Tabar, 2025]</w:t>
-        </w:r>
-      </w:hyperlink>
-      <w:r>
-        <w:t xml:space="preserve">. Ancient proteins that carry out critical cellular processes are disproportionately drivers of human disease, linked to PD, Huntington disease, and ALS </w:t>
-      </w:r>
-      <w:hyperlink r:id="rId42">
-        <w:r>
-          <w:rPr>
-            <w:rStyle w:val="Hyperlink"/>
-          </w:rPr>
-          <w:t>[Marcotte, 2025]</w:t>
-        </w:r>
-      </w:hyperlink>
-      <w:r>
-        <w:t>.</w:t>
-      </w:r>
-    </w:p>
-    <w:p/>
-    <w:p>
-      <w:r>
-        <w:t>────────────────────────────────────────────────────────────</w:t>
-      </w:r>
-    </w:p>
-    <w:p/>
-    <w:p>
-      <w:pPr>
-        <w:pStyle w:val="Heading3"/>
-      </w:pPr>
-      <w:r>
-        <w:t>2.7 Biomarker Development: Alpha-Synuclein Seed Amplification Assays</w:t>
-      </w:r>
-    </w:p>
-    <w:p/>
-    <w:p>
-      <w:r>
-        <w:t xml:space="preserve">Seed amplification assays have emerged as a transformative diagnostic technology. RT-QuIC or seed amplification assays demonstrate unprecedented diagnostic sensitivities and specificities for synucleinopathies in prodromal phases years in advance of parkinsonian signs or dementia onset </w:t>
-      </w:r>
-      <w:hyperlink r:id="rId16">
-        <w:r>
-          <w:rPr>
-            <w:rStyle w:val="Hyperlink"/>
-          </w:rPr>
-          <w:t>[Caughey, 2025]</w:t>
-        </w:r>
-      </w:hyperlink>
-      <w:r>
-        <w:t xml:space="preserve">. Cerebrospinal fluid α-synuclein seeding activity via seed amplification assay predicts central Lewy body diseases in at-risk individuals, with elevated initial SSA AUCs in individuals who develop central LBD </w:t>
-      </w:r>
-      <w:hyperlink r:id="rId18">
-        <w:r>
-          <w:rPr>
-            <w:rStyle w:val="Hyperlink"/>
-          </w:rPr>
-          <w:t>[Goldstein, 2025]</w:t>
-        </w:r>
-      </w:hyperlink>
-      <w:r>
-        <w:t xml:space="preserve">. Among at-risk individuals, those with a-syn RT-QUIC AUCs above 500,000 units had significantly higher rates of developing Lewy body disease (67%, 6 of 9) compared to those with AUCs below the cutoff (0%, 0 of 18; p=0.0003) </w:t>
-      </w:r>
-      <w:hyperlink r:id="rId16">
-        <w:r>
-          <w:rPr>
-            <w:rStyle w:val="Hyperlink"/>
-          </w:rPr>
-          <w:t>[Caughey, 2025]</w:t>
-        </w:r>
-      </w:hyperlink>
-      <w:r>
-        <w:t>.</w:t>
-      </w:r>
-    </w:p>
-    <w:p/>
-    <w:p>
-      <w:r>
-        <w:t xml:space="preserve">Alpha-synuclein RT-QUIC positivity at baseline predicted cognitive decline (MoCA ≤21) in PD participants across two independent cohorts (PPMI: HR 2.36, 95% CI 1.60–3.46, p=0.001; Tuebingen: HR 2.17, 95% CI 1.07–4.41, p=0.03) </w:t>
-      </w:r>
-      <w:hyperlink r:id="rId16">
-        <w:r>
-          <w:rPr>
-            <w:rStyle w:val="Hyperlink"/>
-          </w:rPr>
-          <w:t>[Caughey, 2025]</w:t>
-        </w:r>
-      </w:hyperlink>
-      <w:r>
-        <w:t xml:space="preserve">. An improved α-synuclein RT-QuIC assay can be completed in ≤12 hours for brain, skin, and intestinal mucosa, with positive signals often arising in &lt;5 hours </w:t>
-      </w:r>
-      <w:hyperlink r:id="rId16">
-        <w:r>
-          <w:rPr>
-            <w:rStyle w:val="Hyperlink"/>
-          </w:rPr>
-          <w:t>[Caughey, 2025]</w:t>
-        </w:r>
-      </w:hyperlink>
-      <w:r>
-        <w:t xml:space="preserve">. The enhanced ED-RT-QuIC assay format reduced assay error by as much as 70% </w:t>
-      </w:r>
-      <w:hyperlink r:id="rId16">
-        <w:r>
-          <w:rPr>
-            <w:rStyle w:val="Hyperlink"/>
-          </w:rPr>
-          <w:t>[Caughey, 2025]</w:t>
-        </w:r>
-      </w:hyperlink>
-      <w:r>
-        <w:t xml:space="preserve">. However, current α-synuclein seed amplification assays require ≥48 hours to perform when applied to patient diagnostic biospecimens under standard conditions </w:t>
-      </w:r>
-      <w:hyperlink r:id="rId16">
-        <w:r>
-          <w:rPr>
-            <w:rStyle w:val="Hyperlink"/>
-          </w:rPr>
-          <w:t>[Caughey, 2025]</w:t>
-        </w:r>
-      </w:hyperlink>
-      <w:r>
-        <w:t>.</w:t>
-      </w:r>
-    </w:p>
-    <w:p/>
-    <w:p>
-      <w:r>
-        <w:t xml:space="preserve">Patients with body-first PD presentation show elevated CSF alpha-synuclein seeding activity and intra-neuronal alpha-synuclein deposition in the sympathetic ganglionic chain with profound myocardial catecholamine deficiency </w:t>
-      </w:r>
-      <w:hyperlink r:id="rId16">
-        <w:r>
-          <w:rPr>
-            <w:rStyle w:val="Hyperlink"/>
-          </w:rPr>
-          <w:t>[Caughey, 2025]</w:t>
-        </w:r>
-      </w:hyperlink>
-      <w:r>
-        <w:t>.</w:t>
-      </w:r>
-    </w:p>
-    <w:p/>
-    <w:p>
-      <w:r>
-        <w:t>────────────────────────────────────────────────────────────</w:t>
-      </w:r>
-    </w:p>
-    <w:p/>
-    <w:p>
-      <w:pPr>
-        <w:pStyle w:val="Heading3"/>
-      </w:pPr>
-      <w:r>
-        <w:t>2.8 Autonomic and Cardiac Biomarkers in Lewy Body Diseases</w:t>
-      </w:r>
-    </w:p>
-    <w:p/>
-    <w:p>
-      <w:r>
-        <w:t xml:space="preserve">Lewy body diseases feature profound myocardial depletion of the sympathetic neurotransmitter norepinephrine </w:t>
-      </w:r>
-      <w:hyperlink r:id="rId18">
-        <w:r>
-          <w:rPr>
-            <w:rStyle w:val="Hyperlink"/>
-          </w:rPr>
-          <w:t>[Goldstein, 2025]</w:t>
-        </w:r>
-      </w:hyperlink>
-      <w:r>
-        <w:t xml:space="preserve">. All patients with Lewy body disease showed interventricular septal 18F-dopamine-derived radioactivity below the range of control values (mean decrease 75%; p&lt;0.0001), indicating catecholaminergic neurodegeneration </w:t>
-      </w:r>
-      <w:hyperlink r:id="rId18">
-        <w:r>
-          <w:rPr>
-            <w:rStyle w:val="Hyperlink"/>
-          </w:rPr>
-          <w:t>[Goldstein, 2025]</w:t>
-        </w:r>
-      </w:hyperlink>
-      <w:r>
-        <w:t xml:space="preserve">. Multi-tracer positron emission tomography can assess cardiac sympathetic innervation and vesicular storage in Lewy body diseases </w:t>
-      </w:r>
-      <w:hyperlink r:id="rId18">
-        <w:r>
-          <w:rPr>
-            <w:rStyle w:val="Hyperlink"/>
-          </w:rPr>
-          <w:t>[Goldstein et al., 2025]</w:t>
-        </w:r>
-      </w:hyperlink>
-      <w:r>
-        <w:t xml:space="preserve">. 18F-Dopamine PET imaging distinguishes PD with orthostatic hypotension from MSA based on cardiac noradrenergic deficiency present in PD+OH but absent in MSA </w:t>
-      </w:r>
-      <w:hyperlink r:id="rId18">
-        <w:r>
-          <w:rPr>
-            <w:rStyle w:val="Hyperlink"/>
-          </w:rPr>
-          <w:t>[Goldstein, 2025]</w:t>
-        </w:r>
-      </w:hyperlink>
-      <w:r>
-        <w:t>.</w:t>
-      </w:r>
-    </w:p>
-    <w:p/>
-    <w:p>
-      <w:r>
-        <w:t xml:space="preserve">3,4-Dihydroxyphenylglycol levels separate MSA from PD with orthostatic hypotension </w:t>
-      </w:r>
-      <w:hyperlink r:id="rId18">
-        <w:r>
-          <w:rPr>
-            <w:rStyle w:val="Hyperlink"/>
-          </w:rPr>
-          <w:t>[Goldstein et al., 2025]</w:t>
-        </w:r>
-      </w:hyperlink>
-      <w:r>
-        <w:t xml:space="preserve">. Cardiac arteriovenous increments in plasma DHPG and cardiac norepinephrine spillovers were strikingly decreased in PD+OH compared to MSA </w:t>
-      </w:r>
-      <w:hyperlink r:id="rId18">
-        <w:r>
-          <w:rPr>
-            <w:rStyle w:val="Hyperlink"/>
-          </w:rPr>
-          <w:t>[Goldstein, 2025]</w:t>
-        </w:r>
-      </w:hyperlink>
-      <w:r>
-        <w:t xml:space="preserve">. The LBD group had higher α-syn-TH colocalization indexes than controls with increased α-syn signal intensities in all 3 skin constituents (arrector pili, blood vessels, and sweat glands) </w:t>
-      </w:r>
-      <w:hyperlink r:id="rId18">
-        <w:r>
-          <w:rPr>
-            <w:rStyle w:val="Hyperlink"/>
-          </w:rPr>
-          <w:t>[Goldstein, 2025]</w:t>
-        </w:r>
-      </w:hyperlink>
-      <w:r>
-        <w:t>.</w:t>
-      </w:r>
-    </w:p>
-    <w:p/>
-    <w:p>
-      <w:r>
-        <w:t>────────────────────────────────────────────────────────────</w:t>
-      </w:r>
-    </w:p>
-    <w:p/>
-    <w:p>
-      <w:pPr>
-        <w:pStyle w:val="Heading3"/>
-      </w:pPr>
-      <w:r>
-        <w:t>2.9 Neuroimaging as a Research and Diagnostic Tool</w:t>
-      </w:r>
-    </w:p>
-    <w:p/>
-    <w:p>
-      <w:r>
-        <w:t xml:space="preserve">Diffusion imaging has been developed as an innovative biomarker for differentiating PD, MSAp, and PSP </w:t>
-      </w:r>
-      <w:hyperlink r:id="rId10">
-        <w:r>
-          <w:rPr>
-            <w:rStyle w:val="Hyperlink"/>
-          </w:rPr>
-          <w:t>[Barmpoutis et al., 2025]</w:t>
-        </w:r>
-      </w:hyperlink>
-      <w:r>
-        <w:t xml:space="preserve">. Diffusion Basis Spectrum Imaging (DBSI) MRI has been shown to quantify neuroinflammation in multiple sclerosis and Alzheimer's disease, and is sensitive to intermingled changes in brain microstructure with capacity to measure inflammatory cells within tissue volume </w:t>
-      </w:r>
-      <w:hyperlink r:id="rId43">
-        <w:r>
-          <w:rPr>
-            <w:rStyle w:val="Hyperlink"/>
-          </w:rPr>
-          <w:t>[White et al., 2025]</w:t>
-        </w:r>
-      </w:hyperlink>
-      <w:r>
-        <w:t xml:space="preserve">. Most neuroimaging studies have focused on striatal dopaminergic deficits and fail to adequately explain gait and cognitive impairments in PD </w:t>
-      </w:r>
-      <w:hyperlink r:id="rId44">
-        <w:r>
-          <w:rPr>
-            <w:rStyle w:val="Hyperlink"/>
-          </w:rPr>
-          <w:t>[Maiti et al., 2025]</w:t>
-        </w:r>
-      </w:hyperlink>
-      <w:r>
-        <w:t>.</w:t>
-      </w:r>
-    </w:p>
-    <w:p/>
-    <w:p>
-      <w:r>
-        <w:t xml:space="preserve">Cerebellar resting-state functional connectivity analysis demonstrates altered vermal connectivity with sensorimotor and association cortices in PD, with correlates to gait and cognitive impairment </w:t>
-      </w:r>
-      <w:hyperlink r:id="rId44">
-        <w:r>
-          <w:rPr>
-            <w:rStyle w:val="Hyperlink"/>
-          </w:rPr>
-          <w:t>[Maiti, 2025]</w:t>
-        </w:r>
-      </w:hyperlink>
-      <w:r>
-        <w:t xml:space="preserve">. Radioligands for PET imaging of dopamine transporters and allosteric modulators as PET imaging ligands for mGluR4 and mGluR5 have been developed and characterized in experimental animal models </w:t>
-      </w:r>
-      <w:hyperlink r:id="rId45">
-        <w:r>
-          <w:rPr>
-            <w:rStyle w:val="Hyperlink"/>
-          </w:rPr>
-          <w:t>[Brownell et al., 2025]</w:t>
-        </w:r>
-      </w:hyperlink>
-      <w:r>
-        <w:t xml:space="preserve">. High level imaging instrumentation and techniques as well as unique ligands have been developed to conduct quantitative in vivo imaging studies of dopaminergic and glutamatergic neurofunction </w:t>
-      </w:r>
-      <w:hyperlink r:id="rId45">
-        <w:r>
-          <w:rPr>
-            <w:rStyle w:val="Hyperlink"/>
-          </w:rPr>
-          <w:t>[Brownell, 2025]</w:t>
-        </w:r>
-      </w:hyperlink>
-      <w:r>
-        <w:t xml:space="preserve">. PD, MSAp, and PSP require unique treatment plans and different medications, necessitating clinic-ready and clinical-trial-ready differential diagnostic markers </w:t>
-      </w:r>
-      <w:hyperlink r:id="rId10">
-        <w:r>
-          <w:rPr>
-            <w:rStyle w:val="Hyperlink"/>
-          </w:rPr>
-          <w:t>[Barmpoutis, 2025]</w:t>
-        </w:r>
-      </w:hyperlink>
-      <w:r>
-        <w:t>.</w:t>
-      </w:r>
-    </w:p>
-    <w:p/>
-    <w:p>
-      <w:r>
-        <w:t>────────────────────────────────────────────────────────────</w:t>
-      </w:r>
-    </w:p>
-    <w:p/>
-    <w:p>
-      <w:pPr>
-        <w:pStyle w:val="Heading3"/>
-      </w:pPr>
-      <w:r>
-        <w:t>2.10 Prodromal PD and REM Sleep Behavior Disorder</w:t>
-      </w:r>
-    </w:p>
-    <w:p/>
-    <w:p>
-      <w:r>
-        <w:t xml:space="preserve">REM behavior disorder (RBD) is a recognized preclinical model of Parkinsonism that occurs prior to other diagnoses </w:t>
-      </w:r>
-      <w:hyperlink r:id="rId14">
-        <w:r>
-          <w:rPr>
-            <w:rStyle w:val="Hyperlink"/>
-          </w:rPr>
-          <w:t>[Jaffee, 2025]</w:t>
-        </w:r>
-      </w:hyperlink>
-      <w:r>
-        <w:t xml:space="preserve">. 50–60% of patients with RBD go on to develop PD, while the remainder develop either DLB or MSA </w:t>
-      </w:r>
-      <w:hyperlink r:id="rId14">
-        <w:r>
-          <w:rPr>
-            <w:rStyle w:val="Hyperlink"/>
-          </w:rPr>
-          <w:t>[Jaffee, 2025]</w:t>
-        </w:r>
-      </w:hyperlink>
-      <w:r>
-        <w:t xml:space="preserve">. NAPS2 expands upon NAPS1 and establishes 8 Cores that support a central research Project focused on RBD </w:t>
-      </w:r>
-      <w:hyperlink r:id="rId11">
-        <w:r>
-          <w:rPr>
-            <w:rStyle w:val="Hyperlink"/>
-          </w:rPr>
-          <w:t>[Ju, 2025]</w:t>
-        </w:r>
-      </w:hyperlink>
-      <w:r>
-        <w:t xml:space="preserve">. NAPS1 has enrolled over 200 participants across 10 sites who have completed standardized, comprehensive assessments </w:t>
-      </w:r>
-      <w:hyperlink r:id="rId11">
-        <w:r>
-          <w:rPr>
-            <w:rStyle w:val="Hyperlink"/>
-          </w:rPr>
-          <w:t>[Ju, 2025]</w:t>
-        </w:r>
-      </w:hyperlink>
-      <w:r>
-        <w:t xml:space="preserve">. A sub-cohort enriched for probable REM sleep behavior disorder and constipation (ProPD cohort) included 20,455 individuals who completed olfactory tests and comprehensive surveys of non-motor and early motor features of prodromal PD </w:t>
-      </w:r>
-      <w:hyperlink r:id="rId46">
-        <w:r>
-          <w:rPr>
-            <w:rStyle w:val="Hyperlink"/>
-          </w:rPr>
-          <w:t>[Ascherio et al., 2025]</w:t>
-        </w:r>
-      </w:hyperlink>
-      <w:r>
-        <w:t>.</w:t>
-      </w:r>
-    </w:p>
-    <w:p/>
-    <w:p>
-      <w:r>
-        <w:t>────────────────────────────────────────────────────────────</w:t>
-      </w:r>
-    </w:p>
-    <w:p/>
-    <w:p>
-      <w:pPr>
-        <w:pStyle w:val="Heading3"/>
-      </w:pPr>
-      <w:r>
-        <w:t>2.11 Cognitive Impairment and Dementia in PD</w:t>
-      </w:r>
-    </w:p>
-    <w:p/>
-    <w:p>
-      <w:r>
-        <w:t xml:space="preserve">Cognitive deficits in PD affect up to 80% of PD patients and lead to mild cognitive impairment and dementia </w:t>
-      </w:r>
-      <w:hyperlink r:id="rId47">
-        <w:r>
-          <w:rPr>
-            <w:rStyle w:val="Hyperlink"/>
-          </w:rPr>
-          <w:t>[Cavanagh, 2025]</w:t>
-        </w:r>
-      </w:hyperlink>
-      <w:r>
-        <w:t xml:space="preserve">. Dementia affects up to 80% of PD patients and causes significant morbidity and mortality </w:t>
-      </w:r>
-      <w:hyperlink r:id="rId44">
-        <w:r>
-          <w:rPr>
-            <w:rStyle w:val="Hyperlink"/>
-          </w:rPr>
-          <w:t>[Maiti, 2025]</w:t>
-        </w:r>
-      </w:hyperlink>
-      <w:r>
-        <w:t xml:space="preserve">. The pathophysiology of PD-related cognitive deficits involves interacting and variable impairments of several brain systems, particularly in early to moderate disease, with heterogeneous incidence and natural history </w:t>
-      </w:r>
-      <w:hyperlink r:id="rId48">
-        <w:r>
-          <w:rPr>
-            <w:rStyle w:val="Hyperlink"/>
-          </w:rPr>
-          <w:t>[Albin, 2025]</w:t>
-        </w:r>
-      </w:hyperlink>
-      <w:r>
-        <w:t xml:space="preserve">. Early cholinergic deficits in the cingulo-opercular task control network (AC-I node) predict more rapid cognitive decline in PD </w:t>
-      </w:r>
-      <w:hyperlink r:id="rId48">
-        <w:r>
-          <w:rPr>
-            <w:rStyle w:val="Hyperlink"/>
-          </w:rPr>
-          <w:t>[Albin, 2025]</w:t>
-        </w:r>
-      </w:hyperlink>
-      <w:r>
-        <w:t xml:space="preserve">. Cholinergic terminal deficits in the Cingulo-Opercular Task Control network nodes correlate with both domain-specific and global cognitive deficits in PD </w:t>
-      </w:r>
-      <w:hyperlink r:id="rId48">
-        <w:r>
-          <w:rPr>
-            <w:rStyle w:val="Hyperlink"/>
-          </w:rPr>
-          <w:t>[Albin, 2025]</w:t>
-        </w:r>
-      </w:hyperlink>
-      <w:r>
-        <w:t>.</w:t>
-      </w:r>
-    </w:p>
-    <w:p/>
-    <w:p>
-      <w:r>
-        <w:t xml:space="preserve">PD-related cognitive impairment is linked to dysfunction in frontal midline delta (1–4 Hz) and theta (5–7 Hz) rhythms, with the anterior midcingulate cortex implicated as a potential source </w:t>
-      </w:r>
-      <w:hyperlink r:id="rId47">
-        <w:r>
-          <w:rPr>
-            <w:rStyle w:val="Hyperlink"/>
-          </w:rPr>
-          <w:t>[Cavanagh, 2025]</w:t>
-        </w:r>
-      </w:hyperlink>
-      <w:r>
-        <w:t xml:space="preserve">. Dementia and gait impairment in PD are refractory to dopaminergics, suggesting involvement of other neurotransmitter systems or brain regions beyond nigrostriatal pathways </w:t>
-      </w:r>
-      <w:hyperlink r:id="rId44">
-        <w:r>
-          <w:rPr>
-            <w:rStyle w:val="Hyperlink"/>
-          </w:rPr>
-          <w:t>[Maiti et al., 2025]</w:t>
-        </w:r>
-      </w:hyperlink>
-      <w:r>
-        <w:t xml:space="preserve">. Patients with Lewy body dementia suffer from cognitive impairment and neuropsychiatric symptoms, with a fraction also presenting Parkinsonian motor symptoms </w:t>
-      </w:r>
-      <w:hyperlink r:id="rId49">
-        <w:r>
-          <w:rPr>
-            <w:rStyle w:val="Hyperlink"/>
-          </w:rPr>
-          <w:t>[Chin, 2025]</w:t>
-        </w:r>
-      </w:hyperlink>
-      <w:r>
-        <w:t>.</w:t>
-      </w:r>
-    </w:p>
-    <w:p/>
-    <w:p>
-      <w:r>
-        <w:t>────────────────────────────────────────────────────────────</w:t>
-      </w:r>
-    </w:p>
-    <w:p/>
-    <w:p>
-      <w:pPr>
-        <w:pStyle w:val="Heading3"/>
-      </w:pPr>
-      <w:r>
-        <w:t>2.12 Gait, Motor Dysfunction, and Non-Motor Symptoms</w:t>
-      </w:r>
-    </w:p>
-    <w:p/>
-    <w:p>
-      <w:r>
-        <w:t xml:space="preserve">Postural instability and gait difficulty (PIGD) motor features are common in PD and represent a significant cause of treatment-refractory disability </w:t>
-      </w:r>
-      <w:hyperlink r:id="rId50">
-        <w:r>
-          <w:rPr>
-            <w:rStyle w:val="Hyperlink"/>
-          </w:rPr>
-          <w:t>[Bohnen, 2025]</w:t>
-        </w:r>
-      </w:hyperlink>
-      <w:r>
-        <w:t xml:space="preserve">. Episodic mobility disturbances including falls and freezing of gait are typically preceded by insidiously developing non-episodic PIGD features </w:t>
-      </w:r>
-      <w:hyperlink r:id="rId50">
-        <w:r>
-          <w:rPr>
-            <w:rStyle w:val="Hyperlink"/>
-          </w:rPr>
-          <w:t>[Bohnen, 2025]</w:t>
-        </w:r>
-      </w:hyperlink>
-      <w:r>
-        <w:t xml:space="preserve">. Striatal cholinergic interneuron deficits are a common denominator in the etiology of falls and freezing of gait in PD patients </w:t>
-      </w:r>
-      <w:hyperlink r:id="rId50">
-        <w:r>
-          <w:rPr>
-            <w:rStyle w:val="Hyperlink"/>
-          </w:rPr>
-          <w:t>[Bohnen et al., 2025]</w:t>
-        </w:r>
-      </w:hyperlink>
-      <w:r>
-        <w:t xml:space="preserve">. Cholinergic deficits of the medial geniculate nucleus and entorhinal cortex are robustly associated with non-episodic postural instability and gait difficulty motor features in PD patients </w:t>
-      </w:r>
-      <w:hyperlink r:id="rId50">
-        <w:r>
-          <w:rPr>
-            <w:rStyle w:val="Hyperlink"/>
-          </w:rPr>
-          <w:t>[Bohnen et al., 2025]</w:t>
-        </w:r>
-      </w:hyperlink>
-      <w:r>
-        <w:t>.</w:t>
-      </w:r>
-    </w:p>
-    <w:p/>
-    <w:p>
-      <w:r>
-        <w:t xml:space="preserve">Nonmotor symptoms such as pain, depression, and dementia are leading causes of mortality, diminished quality of life, nursing home placement, and caregiver distress in PD </w:t>
-      </w:r>
-      <w:hyperlink r:id="rId51">
-        <w:r>
-          <w:rPr>
-            <w:rStyle w:val="Hyperlink"/>
-          </w:rPr>
-          <w:t>[Alio, 2025]</w:t>
-        </w:r>
-      </w:hyperlink>
-      <w:r>
-        <w:t xml:space="preserve">. Walking and turning dysfunction appear early in PD </w:t>
-      </w:r>
-      <w:hyperlink r:id="rId52">
-        <w:r>
-          <w:rPr>
-            <w:rStyle w:val="Hyperlink"/>
-          </w:rPr>
-          <w:t>[Mancini, 2025]</w:t>
-        </w:r>
-      </w:hyperlink>
-      <w:r>
-        <w:t xml:space="preserve">. In PD, the reward system is known to be affected, which may contribute to disorders of impaired effort production and excessive fatigue </w:t>
-      </w:r>
-      <w:hyperlink r:id="rId53">
-        <w:r>
-          <w:rPr>
-            <w:rStyle w:val="Hyperlink"/>
-          </w:rPr>
-          <w:t>[Wassermann, 2025]</w:t>
-        </w:r>
-      </w:hyperlink>
-      <w:r>
-        <w:t>.</w:t>
-      </w:r>
-    </w:p>
-    <w:p/>
-    <w:p>
-      <w:r>
-        <w:t>────────────────────────────────────────────────────────────</w:t>
-      </w:r>
-    </w:p>
-    <w:p/>
-    <w:p>
-      <w:pPr>
-        <w:pStyle w:val="Heading3"/>
-      </w:pPr>
-      <w:r>
-        <w:t>2.13 Therapeutic Development and Clinical Interventions</w:t>
-      </w:r>
-    </w:p>
-    <w:p/>
-    <w:p>
-      <w:r>
-        <w:t xml:space="preserve">No medications are yet proven to slow the progression of PD signs, and dopaminergic medications do not benefit all signs of PD </w:t>
-      </w:r>
-      <w:hyperlink r:id="rId12">
-        <w:r>
-          <w:rPr>
-            <w:rStyle w:val="Hyperlink"/>
-          </w:rPr>
-          <w:t>[Corcos et al., 2025]</w:t>
-        </w:r>
-      </w:hyperlink>
-      <w:r>
-        <w:t xml:space="preserve">. There are no available therapies to halt levodopa-induced dyskinesia (LID) development </w:t>
-      </w:r>
-      <w:hyperlink r:id="rId13">
-        <w:r>
-          <w:rPr>
-            <w:rStyle w:val="Hyperlink"/>
-          </w:rPr>
-          <w:t>[Jaunarajs et al., 2025]</w:t>
-        </w:r>
-      </w:hyperlink>
-      <w:r>
-        <w:t xml:space="preserve">, and LID eventually occurs in greater than 90% of PD individuals, with only one FDA-approved drug available for treatment </w:t>
-      </w:r>
-      <w:hyperlink r:id="rId54">
-        <w:r>
-          <w:rPr>
-            <w:rStyle w:val="Hyperlink"/>
-          </w:rPr>
-          <w:t>[Kordower, 2025]</w:t>
-        </w:r>
-      </w:hyperlink>
-      <w:r>
-        <w:t xml:space="preserve">. Striatal voltage-gated CaV1.3 calcium channels have been validated as a therapeutic target for LID amelioration in PD </w:t>
-      </w:r>
-      <w:hyperlink r:id="rId54">
-        <w:r>
-          <w:rPr>
-            <w:rStyle w:val="Hyperlink"/>
-          </w:rPr>
-          <w:t>[Kordower, 2025]</w:t>
-        </w:r>
-      </w:hyperlink>
-      <w:r>
-        <w:t xml:space="preserve">, and genetic silencing of striatal CaV1.3 calcium channels did not interfere with motor activation of levodopa and appeared to enhance it </w:t>
-      </w:r>
-      <w:hyperlink r:id="rId54">
-        <w:r>
-          <w:rPr>
-            <w:rStyle w:val="Hyperlink"/>
-          </w:rPr>
-          <w:t>[Kordower et al., 2025]</w:t>
-        </w:r>
-      </w:hyperlink>
-      <w:r>
-        <w:t>.</w:t>
-      </w:r>
-    </w:p>
-    <w:p/>
-    <w:p>
-      <w:r>
-        <w:t xml:space="preserve">Neurotinib, a highly potent selective cAbl allosteric inhibitor, demonstrated good efficacy in mouse models of PD </w:t>
-      </w:r>
-      <w:hyperlink r:id="rId55">
-        <w:r>
-          <w:rPr>
-            <w:rStyle w:val="Hyperlink"/>
-          </w:rPr>
-          <w:t>[Marugan et al., 2025]</w:t>
-        </w:r>
-      </w:hyperlink>
-      <w:r>
-        <w:t xml:space="preserve">. Treatment with the APT1 inhibitor ML348 improves motor and dementia-like symptoms in genetically modified PD/DLB model mice </w:t>
-      </w:r>
-      <w:hyperlink r:id="rId20">
-        <w:r>
-          <w:rPr>
-            <w:rStyle w:val="Hyperlink"/>
-          </w:rPr>
-          <w:t>[Ho, 2025]</w:t>
-        </w:r>
-      </w:hyperlink>
-      <w:r>
-        <w:t xml:space="preserve">. Dopamine-centered treatments do not improve vocal communication, cognition, or affect in PD despite addressing the hallmark pathology of dopamine loss </w:t>
-      </w:r>
-      <w:hyperlink r:id="rId56">
-        <w:r>
-          <w:rPr>
-            <w:rStyle w:val="Hyperlink"/>
-          </w:rPr>
-          <w:t>[Ciucci, 2025]</w:t>
-        </w:r>
-      </w:hyperlink>
-      <w:r>
-        <w:t xml:space="preserve">. Deep brain stimulation significantly improves motor symptoms and laryngeal motion in PD, but only a subset of patients experiences long-term improvement in speech function </w:t>
-      </w:r>
-      <w:hyperlink r:id="rId57">
-        <w:r>
-          <w:rPr>
-            <w:rStyle w:val="Hyperlink"/>
-          </w:rPr>
-          <w:t>[Mandelberg, 2025]</w:t>
-        </w:r>
-      </w:hyperlink>
-      <w:r>
-        <w:t xml:space="preserve">. Treadmill training provides documented benefits on general parameters of fitness, gait, and functional mobility in PD </w:t>
-      </w:r>
-      <w:hyperlink r:id="rId12">
-        <w:r>
-          <w:rPr>
-            <w:rStyle w:val="Hyperlink"/>
-          </w:rPr>
-          <w:t>[Corcos et al., 2025]</w:t>
-        </w:r>
-      </w:hyperlink>
-      <w:r>
-        <w:t>.</w:t>
-      </w:r>
-    </w:p>
-    <w:p/>
-    <w:p>
-      <w:r>
-        <w:t>────────────────────────────────────────────────────────────</w:t>
-      </w:r>
-    </w:p>
-    <w:p/>
-    <w:p>
-      <w:pPr>
-        <w:pStyle w:val="Heading3"/>
-      </w:pPr>
-      <w:r>
-        <w:t>2.14 High-Throughput Screening and Model Systems</w:t>
-      </w:r>
-    </w:p>
-    <w:p/>
-    <w:p>
-      <w:r>
-        <w:t xml:space="preserve">A 384-well qHTS laser cytometry-based screening assay for PD was developed to evaluate neurodegeneration of dopaminergic neurons in C. elegans strains containing human PD-linked genes, specifically using a model based on LRRK2 mutations </w:t>
-      </w:r>
-      <w:hyperlink r:id="rId58">
-        <w:r>
-          <w:rPr>
-            <w:rStyle w:val="Hyperlink"/>
-          </w:rPr>
-          <w:t>[Inglese, 2025]</w:t>
-        </w:r>
-      </w:hyperlink>
-      <w:r>
-        <w:t xml:space="preserve">. Patient-derived macrophages from Gaucher disease patients in culture mimic the storage phenotype seen in patients </w:t>
-      </w:r>
-      <w:hyperlink r:id="rId9">
-        <w:r>
-          <w:rPr>
-            <w:rStyle w:val="Hyperlink"/>
-          </w:rPr>
-          <w:t>[Sidransky, 2025]</w:t>
-        </w:r>
-      </w:hyperlink>
-      <w:r>
-        <w:t xml:space="preserve">. Isogenic iPSC lines have been generated from Gaucher disease patients carrying different GBA1 variants, including wildtype and knockout genotypes </w:t>
-      </w:r>
-      <w:hyperlink r:id="rId35">
-        <w:r>
-          <w:rPr>
-            <w:rStyle w:val="Hyperlink"/>
-          </w:rPr>
-          <w:t>[Wincovitch, 2025]</w:t>
-        </w:r>
-      </w:hyperlink>
-      <w:r>
-        <w:t xml:space="preserve">. A mouse model of GBA1-associated PD was developed by crossing murine Gaucher models with mutant alpha-synuclein over-expressing mice </w:t>
-      </w:r>
-      <w:hyperlink r:id="rId9">
-        <w:r>
-          <w:rPr>
-            <w:rStyle w:val="Hyperlink"/>
-          </w:rPr>
-          <w:t>[Sidransky, 2025]</w:t>
-        </w:r>
-      </w:hyperlink>
-      <w:r>
-        <w:t xml:space="preserve">. Computational approaches utilizing high-throughput screening data can uncover mechanisms and targets associated with phenotypic assays </w:t>
-      </w:r>
-      <w:hyperlink r:id="rId59">
-        <w:r>
-          <w:rPr>
-            <w:rStyle w:val="Hyperlink"/>
-          </w:rPr>
-          <w:t>[Henderson et al., 2025]</w:t>
-        </w:r>
-      </w:hyperlink>
-      <w:r>
-        <w:t>.</w:t>
-      </w:r>
-    </w:p>
-    <w:p/>
-    <w:p>
-      <w:r>
-        <w:t>────────────────────────────────────────────────────────────</w:t>
-      </w:r>
-    </w:p>
-    <w:p/>
-    <w:p>
-      <w:pPr>
-        <w:pStyle w:val="Heading3"/>
-      </w:pPr>
-      <w:r>
-        <w:t>2.15 Environmental Risk Factors and Disparities</w:t>
-      </w:r>
-    </w:p>
-    <w:p/>
-    <w:p>
-      <w:r>
-        <w:t xml:space="preserve">Manganese is a well-established neurotoxicant that induces neurodegeneration through inflammatory pathways </w:t>
-      </w:r>
-      <w:hyperlink r:id="rId60">
-        <w:r>
-          <w:rPr>
-            <w:rStyle w:val="Hyperlink"/>
-          </w:rPr>
-          <w:t>[Racette, 2025]</w:t>
-        </w:r>
-      </w:hyperlink>
-      <w:r>
-        <w:t xml:space="preserve">. The SMELTER study assembled a cohort of over 800 African residents, including over 700 exposed to manganese emissions from a major smelter, and evaluated participants using the UPDRS motor subsection </w:t>
-      </w:r>
-      <w:hyperlink r:id="rId61">
-        <w:r>
-          <w:rPr>
-            <w:rStyle w:val="Hyperlink"/>
-          </w:rPr>
-          <w:t>[Racette et al., 2025]</w:t>
-        </w:r>
-      </w:hyperlink>
-      <w:r>
-        <w:t xml:space="preserve">. Studies investigating PD features in Black populations are uncommon, with some suggesting that Black patients with PD are more disabled, with greater disease severity, and with different clinical features compared to White PD patients </w:t>
-      </w:r>
-      <w:hyperlink r:id="rId62">
-        <w:r>
-          <w:rPr>
-            <w:rStyle w:val="Hyperlink"/>
-          </w:rPr>
-          <w:t>[Hall, 2025]</w:t>
-        </w:r>
-      </w:hyperlink>
-      <w:r>
-        <w:t xml:space="preserve">. Many patient and family needs most important to people with PD are poorly addressed under traditional care models </w:t>
-      </w:r>
-      <w:hyperlink r:id="rId51">
-        <w:r>
-          <w:rPr>
-            <w:rStyle w:val="Hyperlink"/>
-          </w:rPr>
-          <w:t>[Alio, 2025]</w:t>
-        </w:r>
-      </w:hyperlink>
-      <w:r>
-        <w:t>.</w:t>
-      </w:r>
-    </w:p>
-    <w:p/>
-    <w:p>
-      <w:r>
-        <w:t>────────────────────────────────────────────────────────────</w:t>
-      </w:r>
-    </w:p>
-    <w:p/>
-    <w:p>
-      <w:pPr>
-        <w:pStyle w:val="Heading2"/>
-      </w:pPr>
-      <w:r>
-        <w:t>3. White Space / Gaps</w:t>
-      </w:r>
-    </w:p>
-    <w:p/>
-    <w:p>
-      <w:r>
-        <w:t>Several critical gaps emerge clearly from the synthesized findings:</w:t>
-      </w:r>
-    </w:p>
-    <w:p/>
-    <w:p>
-      <w:r>
-        <w:t>**3.1 Mechanistic Links in Neuroinflammation**</w:t>
-      </w:r>
-    </w:p>
-    <w:p>
-      <w:r>
-        <w:t xml:space="preserve">Direct evidence is lacking for mechanistic links among inflammation, glial dysregulation, and the neuronal loss characteristic of PD </w:t>
-      </w:r>
-      <w:hyperlink r:id="rId26">
-        <w:r>
-          <w:rPr>
-            <w:rStyle w:val="Hyperlink"/>
-          </w:rPr>
-          <w:t>[Cowell et al., 2025]</w:t>
-        </w:r>
-      </w:hyperlink>
-      <w:r>
-        <w:t>. While the role of microglia and astrocytes is recognized, the causal chain from immune activation to dopaminergic neuron death remains poorly delineated.</w:t>
-      </w:r>
-    </w:p>
-    <w:p/>
-    <w:p>
-      <w:r>
-        <w:t>**3.2 Cortical Circuit Dysfunction in PD and DLB**</w:t>
-      </w:r>
-    </w:p>
-    <w:p>
-      <w:r>
-        <w:t xml:space="preserve">Major gaps remain in understanding how cortical circuits become dysfunctional in PD and DLB and how specific features of cortical circuits impact the spread and accumulation of α-synuclein </w:t>
-      </w:r>
-      <w:hyperlink r:id="rId63">
-        <w:r>
-          <w:rPr>
-            <w:rStyle w:val="Hyperlink"/>
-          </w:rPr>
-          <w:t>[Zeiger, 2025]</w:t>
-        </w:r>
-      </w:hyperlink>
-      <w:r>
-        <w:t xml:space="preserve">. Most neuroimaging studies have focused on striatal dopaminergic deficits and fail to adequately explain gait and cognitive impairments </w:t>
-      </w:r>
-      <w:hyperlink r:id="rId44">
-        <w:r>
-          <w:rPr>
-            <w:rStyle w:val="Hyperlink"/>
-          </w:rPr>
-          <w:t>[Maiti et al., 2025]</w:t>
-        </w:r>
-      </w:hyperlink>
-      <w:r>
-        <w:t>.</w:t>
-      </w:r>
-    </w:p>
-    <w:p/>
-    <w:p>
-      <w:r>
-        <w:t>**3.3 Absence of Disease-Modifying Therapies**</w:t>
-      </w:r>
-    </w:p>
-    <w:p>
-      <w:r>
-        <w:t xml:space="preserve">No medications are yet proven to slow the progression of PD signs </w:t>
-      </w:r>
-      <w:hyperlink r:id="rId12">
-        <w:r>
-          <w:rPr>
-            <w:rStyle w:val="Hyperlink"/>
-          </w:rPr>
-          <w:t>[Corcos et al., 2025]</w:t>
-        </w:r>
-      </w:hyperlink>
-      <w:r>
-        <w:t xml:space="preserve">, and there are no available therapies to halt LID development </w:t>
-      </w:r>
-      <w:hyperlink r:id="rId13">
-        <w:r>
-          <w:rPr>
-            <w:rStyle w:val="Hyperlink"/>
-          </w:rPr>
-          <w:t>[Jaunarajs et al., 2025]</w:t>
-        </w:r>
-      </w:hyperlink>
-      <w:r>
-        <w:t>. This represents one of the most consequential unmet needs in the entire portfolio.</w:t>
-      </w:r>
-    </w:p>
-    <w:p/>
-    <w:p>
-      <w:r>
-        <w:t>**3.4 Biomarker Throughput and Speed Limitations**</w:t>
-      </w:r>
-    </w:p>
-    <w:p>
-      <w:r>
-        <w:t xml:space="preserve">Current α-synuclein seed amplification assays require ≥48 hours to perform when applied to patient diagnostic biospecimens </w:t>
-      </w:r>
-      <w:hyperlink r:id="rId16">
-        <w:r>
-          <w:rPr>
-            <w:rStyle w:val="Hyperlink"/>
-          </w:rPr>
-          <w:t>[Caughey, 2025]</w:t>
-        </w:r>
-      </w:hyperlink>
-      <w:r>
-        <w:t xml:space="preserve">, limiting clinical implementation. Current approaches to quantify the proteome also suffer from low sensitivity and throughput, limiting their effectiveness in biomarker discovery applications </w:t>
-      </w:r>
-      <w:hyperlink r:id="rId42">
-        <w:r>
-          <w:rPr>
-            <w:rStyle w:val="Hyperlink"/>
-          </w:rPr>
-          <w:t>[Marcotte, 2025]</w:t>
-        </w:r>
-      </w:hyperlink>
-      <w:r>
-        <w:t>.</w:t>
-      </w:r>
-    </w:p>
-    <w:p/>
-    <w:p>
-      <w:r>
-        <w:t>**3.5 Diagnostic Delays and PD Heterogeneity**</w:t>
-      </w:r>
-    </w:p>
-    <w:p>
-      <w:r>
-        <w:t xml:space="preserve">Diagnostic delay in PD limits the opportunity for early intervention strategies and hampers the ability to study early PD pathophysiology </w:t>
-      </w:r>
-      <w:hyperlink r:id="rId64">
-        <w:r>
-          <w:rPr>
-            <w:rStyle w:val="Hyperlink"/>
-          </w:rPr>
-          <w:t>[Barnett, 2025]</w:t>
-        </w:r>
-      </w:hyperlink>
-      <w:r>
-        <w:t xml:space="preserve">. PD heterogeneity is a major obstacle to effective clinical research </w:t>
-      </w:r>
-      <w:hyperlink r:id="rId48">
-        <w:r>
-          <w:rPr>
-            <w:rStyle w:val="Hyperlink"/>
-          </w:rPr>
-          <w:t>[Albin, 2025]</w:t>
-        </w:r>
-      </w:hyperlink>
-      <w:r>
-        <w:t xml:space="preserve">, and no neurobiomarkers have been identified to describe clinical phenotypes such as tremor dominant and PIGD subtypes despite their recognition since the mid-1990s </w:t>
-      </w:r>
-      <w:hyperlink r:id="rId65">
-        <w:r>
-          <w:rPr>
-            <w:rStyle w:val="Hyperlink"/>
-          </w:rPr>
-          <w:t>[Ince et al., 2025]</w:t>
-        </w:r>
-      </w:hyperlink>
-      <w:r>
-        <w:t>.</w:t>
-      </w:r>
-    </w:p>
-    <w:p/>
-    <w:p>
-      <w:r>
-        <w:t>**3.6 Lewy Body Dementia Diagnosis**</w:t>
-      </w:r>
-    </w:p>
-    <w:p>
-      <w:r>
-        <w:t xml:space="preserve">Lewy body dementia is underdiagnosed due to low sensitivity of clinical diagnosis criteria and challenges in clinical differentiation from Alzheimer's disease, with no reliable biomarker currently available for LBD diagnosis </w:t>
-      </w:r>
-      <w:hyperlink r:id="rId49">
-        <w:r>
-          <w:rPr>
-            <w:rStyle w:val="Hyperlink"/>
-          </w:rPr>
-          <w:t>[Chin, 2025]</w:t>
-        </w:r>
-      </w:hyperlink>
-      <w:r>
-        <w:t>.</w:t>
-      </w:r>
-    </w:p>
-    <w:p/>
-    <w:p>
-      <w:r>
-        <w:t>**3.7 Non-Dopaminergic Symptom Management**</w:t>
-      </w:r>
-    </w:p>
-    <w:p>
-      <w:r>
-        <w:t xml:space="preserve">Dopamine-centered treatments do not improve vocal communication, cognition, or affect in PD </w:t>
-      </w:r>
-      <w:hyperlink r:id="rId56">
-        <w:r>
-          <w:rPr>
-            <w:rStyle w:val="Hyperlink"/>
-          </w:rPr>
-          <w:t>[Ciucci, 2025]</w:t>
-        </w:r>
-      </w:hyperlink>
-      <w:r>
-        <w:t xml:space="preserve">, and dementia and gait impairment are refractory to dopaminergics </w:t>
-      </w:r>
-      <w:hyperlink r:id="rId44">
-        <w:r>
-          <w:rPr>
-            <w:rStyle w:val="Hyperlink"/>
-          </w:rPr>
-          <w:t>[Maiti et al., 2025]</w:t>
-        </w:r>
-      </w:hyperlink>
-      <w:r>
-        <w:t>. The neurobiology underlying these dopamine-resistant features remains underexplored relative to the motor phenotype.</w:t>
-      </w:r>
-    </w:p>
-    <w:p/>
-    <w:p>
-      <w:r>
-        <w:t>**3.8 Computational Methods for Protein Aggregation**</w:t>
-      </w:r>
-    </w:p>
-    <w:p>
-      <w:r>
-        <w:t xml:space="preserve">Methods for calculating linear and multidimensional vibrational spectra from coarse-grained protein and implicit solvent models do not currently exist </w:t>
-      </w:r>
-      <w:hyperlink r:id="rId66">
-        <w:r>
-          <w:rPr>
-            <w:rStyle w:val="Hyperlink"/>
-          </w:rPr>
-          <w:t>[Kananenka, 2025]</w:t>
-        </w:r>
-      </w:hyperlink>
-      <w:r>
-        <w:t xml:space="preserve">, and the study of protein aggregation in the membrane environment involves large length- and timescales beyond current capabilities of traditional all-atom molecular dynamics simulations </w:t>
-      </w:r>
-      <w:hyperlink r:id="rId66">
-        <w:r>
-          <w:rPr>
-            <w:rStyle w:val="Hyperlink"/>
-          </w:rPr>
-          <w:t>[Kananenka, 2025]</w:t>
-        </w:r>
-      </w:hyperlink>
-      <w:r>
-        <w:t>.</w:t>
-      </w:r>
-    </w:p>
-    <w:p/>
-    <w:p>
-      <w:r>
-        <w:t>**3.9 Racial and Ethnic Disparities**</w:t>
-      </w:r>
-    </w:p>
-    <w:p>
-      <w:r>
-        <w:t xml:space="preserve">Studies investigating PD features in Black populations are uncommon </w:t>
-      </w:r>
-      <w:hyperlink r:id="rId62">
-        <w:r>
-          <w:rPr>
-            <w:rStyle w:val="Hyperlink"/>
-          </w:rPr>
-          <w:t>[Hall, 2025]</w:t>
-        </w:r>
-      </w:hyperlink>
-      <w:r>
-        <w:t>, representing a significant equity gap in the portfolio. Environmental contributions—such as manganese exposure in occupational and geographic contexts—are also understudied relative to the scale of the problem.</w:t>
-      </w:r>
-    </w:p>
-    <w:p/>
-    <w:p>
-      <w:r>
-        <w:t>────────────────────────────────────────────────────────────</w:t>
-      </w:r>
-    </w:p>
-    <w:p/>
-    <w:p>
-      <w:pPr>
-        <w:pStyle w:val="Heading2"/>
-      </w:pPr>
-      <w:r>
-        <w:t>4. Rising Signals</w:t>
-      </w:r>
-    </w:p>
-    <w:p/>
-    <w:p>
-      <w:r>
-        <w:t>**4.1 Seed Amplification Assays as Prodromal Diagnostic Platforms**</w:t>
-      </w:r>
-    </w:p>
-    <w:p>
-      <w:r>
-        <w:t xml:space="preserve">The rapid improvement in α-syn RT-QuIC technology—including reduced assay time to ≤12 hours and up to 70% error reduction </w:t>
-      </w:r>
-      <w:hyperlink r:id="rId16">
-        <w:r>
-          <w:rPr>
-            <w:rStyle w:val="Hyperlink"/>
-          </w:rPr>
-          <w:t>[Caughey, 2025]</w:t>
-        </w:r>
-      </w:hyperlink>
-      <w:r>
-        <w:t xml:space="preserve">—signals a near-term transition from research tool to clinical diagnostic. The strong predictive validity for LBD development in at-risk individuals </w:t>
-      </w:r>
-      <w:hyperlink r:id="rId16">
-        <w:r>
-          <w:rPr>
-            <w:rStyle w:val="Hyperlink"/>
-          </w:rPr>
-          <w:t>[Caughey, 2025]</w:t>
-        </w:r>
-      </w:hyperlink>
-      <w:r>
-        <w:t xml:space="preserve"> suggests these assays could anchor future prevention trial enrollment strategies.</w:t>
-      </w:r>
-    </w:p>
-    <w:p/>
-    <w:p>
-      <w:r>
-        <w:t>**4.2 Body-First vs. Brain-First PD Subtypes**</w:t>
-      </w:r>
-    </w:p>
-    <w:p>
-      <w:r>
-        <w:t xml:space="preserve">The characterization of body-first PD presentation with elevated CSF α-syn seeding activity, sympathetic ganglionic α-syn deposition, and profound myocardial catecholamine deficiency </w:t>
-      </w:r>
-      <w:hyperlink r:id="rId16">
-        <w:r>
-          <w:rPr>
-            <w:rStyle w:val="Hyperlink"/>
-          </w:rPr>
-          <w:t>[Caughey, 2025]</w:t>
-        </w:r>
-      </w:hyperlink>
-      <w:r>
-        <w:t xml:space="preserve"> represents an emerging disease subtype framework with significant implications for biomarker selection, trial design, and mechanistic research.</w:t>
-      </w:r>
-    </w:p>
-    <w:p/>
-    <w:p>
-      <w:r>
-        <w:t>**4.3 LRRK2-Gut-Inflammation Axis**</w:t>
-      </w:r>
-    </w:p>
-    <w:p>
-      <w:r>
-        <w:t xml:space="preserve">The finding that LRRK2 kinase hyperactivity results from the same SNPs (G2019S, N2081D) that increase susceptibility to both PD and Crohn's disease </w:t>
-      </w:r>
-      <w:hyperlink r:id="rId22">
-        <w:r>
-          <w:rPr>
-            <w:rStyle w:val="Hyperlink"/>
-          </w:rPr>
-          <w:t>[Liu, 2025]</w:t>
-        </w:r>
-      </w:hyperlink>
-      <w:r>
-        <w:t xml:space="preserve">, combined with evidence that macrophage LRRK2 kinase activity plays a key role in gut inflammation </w:t>
-      </w:r>
-      <w:hyperlink r:id="rId22">
-        <w:r>
-          <w:rPr>
-            <w:rStyle w:val="Hyperlink"/>
-          </w:rPr>
-          <w:t>[Liu et al., 2025]</w:t>
-        </w:r>
-      </w:hyperlink>
-      <w:r>
-        <w:t>, is an emerging signal linking peripheral immune dysfunction to central neurodegeneration with potential therapeutic implications.</w:t>
-      </w:r>
-    </w:p>
-    <w:p/>
-    <w:p>
-      <w:r>
-        <w:t>**4.4 NOX2-Mediated ROS Amplification**</w:t>
-      </w:r>
-    </w:p>
-    <w:p>
-      <w:r>
-        <w:t xml:space="preserve">The discovery that NOX2 serves as an amplifier of mitochondrially-derived ROS via a feedforward RIRP cycle in PD pathogenesis </w:t>
-      </w:r>
-      <w:hyperlink r:id="rId28">
-        <w:r>
-          <w:rPr>
-            <w:rStyle w:val="Hyperlink"/>
-          </w:rPr>
-          <w:t>[Di Maio et al., 2025]</w:t>
-        </w:r>
-      </w:hyperlink>
-      <w:r>
-        <w:t xml:space="preserve">, with potential contributions from NOX1 and NOX4 isoforms </w:t>
-      </w:r>
-      <w:hyperlink r:id="rId28">
-        <w:r>
-          <w:rPr>
-            <w:rStyle w:val="Hyperlink"/>
-          </w:rPr>
-          <w:t>[Di Maio et al., 2025]</w:t>
-        </w:r>
-      </w:hyperlink>
-      <w:r>
-        <w:t>, represents a mechanistically novel convergence point between oxidative stress and neuroinflammation.</w:t>
-      </w:r>
-    </w:p>
-    <w:p/>
-    <w:p>
-      <w:r>
-        <w:t>**4.5 Palmitoylation and Vesicle Trafficking**</w:t>
-      </w:r>
-    </w:p>
-    <w:p>
-      <w:r>
-        <w:t xml:space="preserve">Palmitoylation's role in normal protein and vesicle trafficking </w:t>
-      </w:r>
-      <w:hyperlink r:id="rId20">
-        <w:r>
-          <w:rPr>
-            <w:rStyle w:val="Hyperlink"/>
-          </w:rPr>
-          <w:t>[Ho et al., 2025]</w:t>
-        </w:r>
-      </w:hyperlink>
-      <w:r>
-        <w:t xml:space="preserve">, and the finding that disease-associated α-synuclein disrupts trafficking while palmitoylation facilitates it </w:t>
-      </w:r>
-      <w:hyperlink r:id="rId20">
-        <w:r>
-          <w:rPr>
-            <w:rStyle w:val="Hyperlink"/>
-          </w:rPr>
-          <w:t>[Ho, 2025]</w:t>
-        </w:r>
-      </w:hyperlink>
-      <w:r>
-        <w:t xml:space="preserve">, positions the palmitoylation pathway as an underexplored therapeutic target. Treatment with the APT1 inhibitor ML348 shows functional improvement in PD/DLB model mice </w:t>
-      </w:r>
-      <w:hyperlink r:id="rId20">
-        <w:r>
-          <w:rPr>
-            <w:rStyle w:val="Hyperlink"/>
-          </w:rPr>
-          <w:t>[Ho, 2025]</w:t>
-        </w:r>
-      </w:hyperlink>
-      <w:r>
-        <w:t>.</w:t>
-      </w:r>
-    </w:p>
-    <w:p/>
-    <w:p>
-      <w:r>
-        <w:t>**4.6 CaV1.3 Calcium Channels as a Validated LID Target**</w:t>
-      </w:r>
-    </w:p>
-    <w:p>
-      <w:r>
-        <w:t xml:space="preserve">Striatal CaV1.3 calcium channels have been validated as a therapeutic target for LID amelioration </w:t>
-      </w:r>
-      <w:hyperlink r:id="rId54">
-        <w:r>
-          <w:rPr>
-            <w:rStyle w:val="Hyperlink"/>
-          </w:rPr>
-          <w:t>[Kordower, 2025]</w:t>
-        </w:r>
-      </w:hyperlink>
-      <w:r>
-        <w:t xml:space="preserve">, and their genetic silencing appears to enhance rather than impair levodopa's motor benefits </w:t>
-      </w:r>
-      <w:hyperlink r:id="rId54">
-        <w:r>
-          <w:rPr>
-            <w:rStyle w:val="Hyperlink"/>
-          </w:rPr>
-          <w:t>[Kordower et al., 2025]</w:t>
-        </w:r>
-      </w:hyperlink>
-      <w:r>
-        <w:t>. Given the near-universal incidence of LID with prolonged levodopa therapy, this pathway warrants accelerated translational investment.</w:t>
-      </w:r>
-    </w:p>
-    <w:p/>
-    <w:p>
-      <w:r>
-        <w:t>**4.7 Cholinergic System as a Multi-Symptom Target**</w:t>
-      </w:r>
-    </w:p>
-    <w:p>
-      <w:r>
-        <w:t xml:space="preserve">Convergent findings—including cholinergic deficits predicting cognitive decline </w:t>
-      </w:r>
-      <w:hyperlink r:id="rId48">
-        <w:r>
-          <w:rPr>
-            <w:rStyle w:val="Hyperlink"/>
-          </w:rPr>
-          <w:t>[Albin, 2025]</w:t>
-        </w:r>
-      </w:hyperlink>
-      <w:r>
-        <w:t xml:space="preserve">, striatal cholinergic interneuron deficits underlying gait and falls </w:t>
-      </w:r>
-      <w:hyperlink r:id="rId50">
-        <w:r>
-          <w:rPr>
-            <w:rStyle w:val="Hyperlink"/>
-          </w:rPr>
-          <w:t>[Bohnen et al., 2025]</w:t>
-        </w:r>
-      </w:hyperlink>
-      <w:r>
-        <w:t xml:space="preserve">, and degeneration of the pedunculopontine nucleus causing cholinergic denervation of the vermis </w:t>
-      </w:r>
-      <w:hyperlink r:id="rId44">
-        <w:r>
-          <w:rPr>
-            <w:rStyle w:val="Hyperlink"/>
-          </w:rPr>
-          <w:t>[Maiti, 2025]</w:t>
-        </w:r>
-      </w:hyperlink>
-      <w:r>
-        <w:t>—collectively position the cholinergic system as a high-priority multi-symptom target for PD that extends well beyond classic dopaminergic frameworks.</w:t>
-      </w:r>
-    </w:p>
-    <w:p/>
-    <w:p>
-      <w:r>
-        <w:t>**4.8 Epigenetic Dysregulation in Lewy Body Disease**</w:t>
-      </w:r>
-    </w:p>
-    <w:p>
-      <w:r>
-        <w:t xml:space="preserve">The finding that histone acetylation is markedly dysregulated in DLB and PD at autopsy </w:t>
-      </w:r>
-      <w:hyperlink r:id="rId21">
-        <w:r>
-          <w:rPr>
-            <w:rStyle w:val="Hyperlink"/>
-          </w:rPr>
-          <w:t>[Stephen N. Gomperts, 2025]</w:t>
-        </w:r>
-      </w:hyperlink>
-      <w:r>
-        <w:t xml:space="preserve"> is an early signal of potential epigenetic mechanisms in synucleinopathy that may offer new therapeutic access points.</w:t>
-      </w:r>
-    </w:p>
-    <w:p/>
-    <w:p>
-      <w:r>
-        <w:t>**4.9 TMEM230 and Synaptic Vesicle Recycling**</w:t>
-      </w:r>
-    </w:p>
-    <w:p>
-      <w:r>
-        <w:t xml:space="preserve">TMEM230 is the first transmembrane protein of synaptic vesicles identified in PD </w:t>
-      </w:r>
-      <w:hyperlink r:id="rId36">
-        <w:r>
-          <w:rPr>
-            <w:rStyle w:val="Hyperlink"/>
-          </w:rPr>
-          <w:t>[Han-Xiang Deng, 2025]</w:t>
-        </w:r>
-      </w:hyperlink>
-      <w:r>
-        <w:t xml:space="preserve">, and PD-linked mutations in TMEM230 impair synaptic vesicle recycling by affecting budding from the presynaptic membrane </w:t>
-      </w:r>
-      <w:hyperlink r:id="rId36">
-        <w:r>
-          <w:rPr>
-            <w:rStyle w:val="Hyperlink"/>
-          </w:rPr>
-          <w:t>[Deng, 2025]</w:t>
-        </w:r>
-      </w:hyperlink>
-      <w:r>
-        <w:t>. This opens a novel mechanistic window into the synaptic vesicle biology of PD.</w:t>
-      </w:r>
-    </w:p>
-    <w:p/>
-    <w:p>
-      <w:r>
-        <w:t>**4.10 Wearable Technology for Objective Gait Monitoring**</w:t>
-      </w:r>
-    </w:p>
-    <w:p>
-      <w:r>
-        <w:t xml:space="preserve">New wearable technology can provide reliable, objective measures of walking and turning that are feasible for clinical trials </w:t>
-      </w:r>
-      <w:hyperlink r:id="rId52">
-        <w:r>
-          <w:rPr>
-            <w:rStyle w:val="Hyperlink"/>
-          </w:rPr>
-          <w:t>[Mancini, 2025]</w:t>
-        </w:r>
-      </w:hyperlink>
-      <w:r>
-        <w:t xml:space="preserve">. Given that walking and turning dysfunction appear early in PD </w:t>
-      </w:r>
-      <w:hyperlink r:id="rId52">
-        <w:r>
-          <w:rPr>
-            <w:rStyle w:val="Hyperlink"/>
-          </w:rPr>
-          <w:t>[Mancini, 2025]</w:t>
-        </w:r>
-      </w:hyperlink>
-      <w:r>
-        <w:t>, wearables represent an emerging platform for both disease monitoring and endpoint measurement in future intervention trials.</w:t>
-      </w:r>
-    </w:p>
-    <w:p/>
-    <w:p>
-      <w:r>
-        <w:t>────────────────────────────────────────────────────────────</w:t>
-      </w:r>
-    </w:p>
-    <w:p/>
-    <w:p>
-      <w:r>
-        <w:t>*Report prepared based on verified findings from 110 NIH Reporter research clusters (2025). All claims are directly supported by cited evidence.*</w:t>
+        <w:t xml:space="preserve"> that the field is building toward.</w:t>
       </w:r>
     </w:p>
     <w:sectPr>

</xml_diff>